<commit_message>
Actualizando archivos del proyecto
</commit_message>
<xml_diff>
--- a/Maps_extracted/Maps/Informe_Luminarias_UCE_Grupo3.docx
+++ b/Maps_extracted/Maps/Informe_Luminarias_UCE_Grupo3.docx
@@ -1,6 +1,6 @@
 
 <file path=word/document.xml><?xml version="1.0" encoding="utf-8"?>
-<w:document xmlns:wpc="http://schemas.microsoft.com/office/word/2010/wordprocessingCanvas" xmlns:cx="http://schemas.microsoft.com/office/drawing/2014/chartex" xmlns:cx1="http://schemas.microsoft.com/office/drawing/2015/9/8/chartex" xmlns:cx2="http://schemas.microsoft.com/office/drawing/2015/10/21/chartex" xmlns:cx3="http://schemas.microsoft.com/office/drawing/2016/5/9/chartex" xmlns:cx4="http://schemas.microsoft.com/office/drawing/2016/5/10/chartex" xmlns:cx5="http://schemas.microsoft.com/office/drawing/2016/5/11/chartex" xmlns:cx6="http://schemas.microsoft.com/office/drawing/2016/5/12/chartex" xmlns:cx7="http://schemas.microsoft.com/office/drawing/2016/5/13/chartex" xmlns:cx8="http://schemas.microsoft.com/office/drawing/2016/5/14/chartex" xmlns:mc="http://schemas.openxmlformats.org/markup-compatibility/2006" xmlns:aink="http://schemas.microsoft.com/office/drawing/2016/ink" xmlns:am3d="http://schemas.microsoft.com/office/drawing/2017/model3d" xmlns:o="urn:schemas-microsoft-com:office:office" xmlns:oel="http://schemas.microsoft.com/office/2019/extlst" xmlns:r="http://schemas.openxmlformats.org/officeDocument/2006/relationships" xmlns:m="http://schemas.openxmlformats.org/officeDocument/2006/math" xmlns:v="urn:schemas-microsoft-com:vml" xmlns:wp14="http://schemas.microsoft.com/office/word/2010/wordprocessingDrawing" xmlns:wp="http://schemas.openxmlformats.org/drawingml/2006/wordprocessingDrawing" xmlns:w10="urn:schemas-microsoft-com:office:word" xmlns:w="http://schemas.openxmlformats.org/wordprocessingml/2006/main" xmlns:w14="http://schemas.microsoft.com/office/word/2010/wordml" xmlns:w15="http://schemas.microsoft.com/office/word/2012/wordml" xmlns:w16cex="http://schemas.microsoft.com/office/word/2018/wordml/cex" xmlns:w16cid="http://schemas.microsoft.com/office/word/2016/wordml/cid" xmlns:w16="http://schemas.microsoft.com/office/word/2018/wordml" xmlns:w16du="http://schemas.microsoft.com/office/word/2023/wordml/word16du" xmlns:w16sdtdh="http://schemas.microsoft.com/office/word/2020/wordml/sdtdatahash" xmlns:w16sdtfl="http://schemas.microsoft.com/office/word/2024/wordml/sdtformatlock" xmlns:w16se="http://schemas.microsoft.com/office/word/2015/wordml/symex" xmlns:wpg="http://schemas.microsoft.com/office/word/2010/wordprocessingGroup" xmlns:wpi="http://schemas.microsoft.com/office/word/2010/wordprocessingInk" xmlns:wne="http://schemas.microsoft.com/office/word/2006/wordml" xmlns:wps="http://schemas.microsoft.com/office/word/2010/wordprocessingShape" mc:Ignorable="w14 w15 w16se w16cid w16 w16cex w16sdtdh w16sdtfl w16du wp14">
+<w:document xmlns:wpc="http://schemas.microsoft.com/office/word/2010/wordprocessingCanvas" xmlns:cx="http://schemas.microsoft.com/office/drawing/2014/chartex" xmlns:cx1="http://schemas.microsoft.com/office/drawing/2015/9/8/chartex" xmlns:cx2="http://schemas.microsoft.com/office/drawing/2015/10/21/chartex" xmlns:cx3="http://schemas.microsoft.com/office/drawing/2016/5/9/chartex" xmlns:cx4="http://schemas.microsoft.com/office/drawing/2016/5/10/chartex" xmlns:cx5="http://schemas.microsoft.com/office/drawing/2016/5/11/chartex" xmlns:cx6="http://schemas.microsoft.com/office/drawing/2016/5/12/chartex" xmlns:cx7="http://schemas.microsoft.com/office/drawing/2016/5/13/chartex" xmlns:cx8="http://schemas.microsoft.com/office/drawing/2016/5/14/chartex" xmlns:mc="http://schemas.openxmlformats.org/markup-compatibility/2006" xmlns:aink="http://schemas.microsoft.com/office/drawing/2016/ink" xmlns:am3d="http://schemas.microsoft.com/office/drawing/2017/model3d" xmlns:o="urn:schemas-microsoft-com:office:office" xmlns:r="http://schemas.openxmlformats.org/officeDocument/2006/relationships" xmlns:m="http://schemas.openxmlformats.org/officeDocument/2006/math" xmlns:v="urn:schemas-microsoft-com:vml" xmlns:wp14="http://schemas.microsoft.com/office/word/2010/wordprocessingDrawing" xmlns:wp="http://schemas.openxmlformats.org/drawingml/2006/wordprocessingDrawing" xmlns:w10="urn:schemas-microsoft-com:office:word" xmlns:w="http://schemas.openxmlformats.org/wordprocessingml/2006/main" xmlns:w14="http://schemas.microsoft.com/office/word/2010/wordml" xmlns:w15="http://schemas.microsoft.com/office/word/2012/wordml" xmlns:w16cex="http://schemas.microsoft.com/office/word/2018/wordml/cex" xmlns:w16cid="http://schemas.microsoft.com/office/word/2016/wordml/cid" xmlns:w16="http://schemas.microsoft.com/office/word/2018/wordml" xmlns:w16sdtdh="http://schemas.microsoft.com/office/word/2020/wordml/sdtdatahash" xmlns:w16se="http://schemas.microsoft.com/office/word/2015/wordml/symex" xmlns:wpg="http://schemas.microsoft.com/office/word/2010/wordprocessingGroup" xmlns:wpi="http://schemas.microsoft.com/office/word/2010/wordprocessingInk" xmlns:wne="http://schemas.microsoft.com/office/word/2006/wordml" xmlns:wps="http://schemas.microsoft.com/office/word/2010/wordprocessingShape" mc:Ignorable="w14 w15 w16se w16cid w16 w16cex w16sdtdh wp14">
   <w:body>
     <w:p>
       <w:pPr>
@@ -94,6 +94,12 @@
       <w:pPr>
         <w:spacing w:after="2000"/>
         <w:jc w:val="center"/>
+        <w:rPr>
+          <w:b/>
+          <w:bCs/>
+          <w:sz w:val="28"/>
+          <w:szCs w:val="28"/>
+        </w:rPr>
       </w:pPr>
     </w:p>
     <w:p>
@@ -116,20 +122,41 @@
           <w:sz w:val="24"/>
           <w:szCs w:val="24"/>
         </w:rPr>
-        <w:t>El presente informe documenta el levantamiento y análisis detallado de la infraestructura de iluminación exterior en diversas áreas de la Universidad Central del Ecuador (UCE), específicamente en las facultades y dependencias asignadas al Grupo 3. La iluminación adecuada en un campus universitario es un factor crítico no solo para garantizar la seguridad de los estudiantes, docentes y personal administrativo durante las horas nocturnas, sino también para promover la eficiencia energética, cumplir con las normativas vigentes y reducir el impacto ambiental.</w:t>
-      </w:r>
-    </w:p>
-    <w:p>
-      <w:pPr>
-        <w:spacing w:after="200"/>
-        <w:jc w:val="both"/>
-      </w:pPr>
-      <w:r>
-        <w:rPr>
-          <w:sz w:val="24"/>
-          <w:szCs w:val="24"/>
-        </w:rPr>
-        <w:t xml:space="preserve">En el contexto actual de crisis energética y conciencia ambiental, la evaluación de tecnologías obsoletas como las luminarias de vapor de sodio frente a alternativas modernas como la tecnología LED resulta indispensable. A través de un levantamiento georreferenciado utilizando herramientas como </w:t>
+        <w:t xml:space="preserve">El presente informe documenta el levantamiento y análisis detallado de la infraestructura de iluminación </w:t>
+      </w:r>
+      <w:r>
+        <w:rPr>
+          <w:sz w:val="24"/>
+          <w:szCs w:val="24"/>
+        </w:rPr>
+        <w:t>exterior en diversas áreas de la Universidad Central del Ecuador (UCE), específicamente en las facultades y dependencias asignadas al Grupo 3. La iluminación adecuada en un campus universitario es un factor crítico no solo para garantizar la seguridad de l</w:t>
+      </w:r>
+      <w:r>
+        <w:rPr>
+          <w:sz w:val="24"/>
+          <w:szCs w:val="24"/>
+        </w:rPr>
+        <w:t>os estudiantes, docentes y personal administrativo durante las horas nocturnas, sino también para promover la eficiencia energética, cumplir con las normativas vigentes y reducir el impacto ambiental.</w:t>
+      </w:r>
+    </w:p>
+    <w:p>
+      <w:pPr>
+        <w:spacing w:after="200"/>
+        <w:jc w:val="both"/>
+      </w:pPr>
+      <w:r>
+        <w:rPr>
+          <w:sz w:val="24"/>
+          <w:szCs w:val="24"/>
+        </w:rPr>
+        <w:t>En el contexto actual de crisis energética y conciencia</w:t>
+      </w:r>
+      <w:r>
+        <w:rPr>
+          <w:sz w:val="24"/>
+          <w:szCs w:val="24"/>
+        </w:rPr>
+        <w:t xml:space="preserve"> ambiental, la evaluación de tecnologías obsoletas como las luminarias de vapor de sodio frente a alternativas modernas como la tecnología LED resulta indispensable. A través de un levantamiento georreferenciado utilizando herramientas como </w:t>
       </w:r>
       <w:proofErr w:type="spellStart"/>
       <w:r>
@@ -145,7 +172,14 @@
           <w:sz w:val="24"/>
           <w:szCs w:val="24"/>
         </w:rPr>
-        <w:t xml:space="preserve"> y mediciones en sitio de luxes, se ha consolidado una base de datos de 149 luminarias para su análisis técnico, estadístico, espacial y financiero.</w:t>
+        <w:t xml:space="preserve"> y m</w:t>
+      </w:r>
+      <w:r>
+        <w:rPr>
+          <w:sz w:val="24"/>
+          <w:szCs w:val="24"/>
+        </w:rPr>
+        <w:t>ediciones en sitio de luxes, se ha consolidado una base de datos de 149 luminarias para su análisis técnico, estadístico, espacial y financiero.</w:t>
       </w:r>
     </w:p>
     <w:p>
@@ -176,7 +210,14 @@
           <w:sz w:val="24"/>
           <w:szCs w:val="24"/>
         </w:rPr>
-        <w:t>Evaluar integralmente la infraestructura de iluminación exterior actual en las áreas asignadas al Grupo 3 de la UCE para determinar la viabilidad técnica, económica, energética y ambiental de una migración tecnológica de lámparas de vapor de sodio a tecnología LED.</w:t>
+        <w:t>Evaluar integralmente la infraestructura de iluminación exterior actual en la</w:t>
+      </w:r>
+      <w:r>
+        <w:rPr>
+          <w:sz w:val="24"/>
+          <w:szCs w:val="24"/>
+        </w:rPr>
+        <w:t>s áreas asignadas al Grupo 3 de la UCE para determinar la viabilidad técnica, económica, energética y ambiental de una migración tecnológica de lámparas de vapor de sodio a tecnología LED.</w:t>
       </w:r>
     </w:p>
     <w:p>
@@ -198,20 +239,34 @@
           <w:sz w:val="24"/>
           <w:szCs w:val="24"/>
         </w:rPr>
-        <w:t>• Mapear y registrar geográficamente las luminarias de las facultades de Ingeniería y Ciencias Aplicadas, Jurisprudencia, Filosofía, Letras y Ciencias de la Educación, Ciencias Sociales y Humanas, y Servicios Generales (Física).</w:t>
-      </w:r>
-    </w:p>
-    <w:p>
-      <w:pPr>
-        <w:spacing w:after="200"/>
-        <w:jc w:val="both"/>
-      </w:pPr>
-      <w:r>
-        <w:rPr>
-          <w:sz w:val="24"/>
-          <w:szCs w:val="24"/>
-        </w:rPr>
-        <w:t>• Realizar mediciones in situ de la iluminancia (luxes) utilizando el luxómetro UNI-T Mini Light Meter UT383 para verificar el cumplimiento normativo.</w:t>
+        <w:t xml:space="preserve">• Mapear y registrar geográficamente las </w:t>
+      </w:r>
+      <w:r>
+        <w:rPr>
+          <w:sz w:val="24"/>
+          <w:szCs w:val="24"/>
+        </w:rPr>
+        <w:t>luminarias de las facultades de Ingeniería y Ciencias Aplicadas, Jurisprudencia, Filosofía, Letras y Ciencias de la Educación, Ciencias Sociales y Humanas, y Servicios Generales (Física).</w:t>
+      </w:r>
+    </w:p>
+    <w:p>
+      <w:pPr>
+        <w:spacing w:after="200"/>
+        <w:jc w:val="both"/>
+      </w:pPr>
+      <w:r>
+        <w:rPr>
+          <w:sz w:val="24"/>
+          <w:szCs w:val="24"/>
+        </w:rPr>
+        <w:t>• Realizar mediciones in situ de la iluminancia (luxes) utilizando e</w:t>
+      </w:r>
+      <w:r>
+        <w:rPr>
+          <w:sz w:val="24"/>
+          <w:szCs w:val="24"/>
+        </w:rPr>
+        <w:t>l luxómetro UNI-T Mini Light Meter UT383 para verificar el cumplimiento normativo.</w:t>
       </w:r>
     </w:p>
     <w:p>
@@ -237,20 +292,34 @@
           <w:sz w:val="24"/>
           <w:szCs w:val="24"/>
         </w:rPr>
-        <w:t>• Analizar el cumplimiento de los niveles de iluminación actuales frente a las normativas nacionales (NTE INEN 069, Regulación ARCONEL 005/18) e internacionales aplicables.</w:t>
-      </w:r>
-    </w:p>
-    <w:p>
-      <w:pPr>
-        <w:spacing w:after="200"/>
-        <w:jc w:val="both"/>
-      </w:pPr>
-      <w:r>
-        <w:rPr>
-          <w:sz w:val="24"/>
-          <w:szCs w:val="24"/>
-        </w:rPr>
-        <w:t>• Ejecutar un análisis financiero comparativo que incluya costos de adquisición, instalación, operación y mantenimiento (CAPEX y OPEX) de las tecnologías LED vs. Sodio.</w:t>
+        <w:t>• Analizar el cump</w:t>
+      </w:r>
+      <w:r>
+        <w:rPr>
+          <w:sz w:val="24"/>
+          <w:szCs w:val="24"/>
+        </w:rPr>
+        <w:t>limiento de los niveles de iluminación actuales frente a las normativas nacionales (NTE INEN 069, Regulación ARCONEL 005/18) e internacionales aplicables.</w:t>
+      </w:r>
+    </w:p>
+    <w:p>
+      <w:pPr>
+        <w:spacing w:after="200"/>
+        <w:jc w:val="both"/>
+      </w:pPr>
+      <w:r>
+        <w:rPr>
+          <w:sz w:val="24"/>
+          <w:szCs w:val="24"/>
+        </w:rPr>
+        <w:t>• Ejecutar un análisis financiero comparativo que incluya costos de adquisición, instalación, operaci</w:t>
+      </w:r>
+      <w:r>
+        <w:rPr>
+          <w:sz w:val="24"/>
+          <w:szCs w:val="24"/>
+        </w:rPr>
+        <w:t>ón y mantenimiento (CAPEX y OPEX) de las tecnologías LED vs. Sodio.</w:t>
       </w:r>
     </w:p>
     <w:p>
@@ -276,7 +345,14 @@
           <w:sz w:val="24"/>
           <w:szCs w:val="24"/>
         </w:rPr>
-        <w:t>• Cuantificar el impacto ambiental y la reducción de la huella de carbono derivada de la potencial modernización tecnológica.</w:t>
+        <w:t>• Cu</w:t>
+      </w:r>
+      <w:r>
+        <w:rPr>
+          <w:sz w:val="24"/>
+          <w:szCs w:val="24"/>
+        </w:rPr>
+        <w:t>antificar el impacto ambiental y la reducción de la huella de carbono derivada de la potencial modernización tecnológica.</w:t>
       </w:r>
     </w:p>
     <w:p>
@@ -322,7 +398,21 @@
           <w:sz w:val="24"/>
           <w:szCs w:val="24"/>
         </w:rPr>
-        <w:t xml:space="preserve"> es una plataforma de código abierto diseñada para la recopilación de datos en campo en entornos complejos. Facilita la creación de formularios digitales estructurados, permitiendo la recolección offline, captura de coordenadas GPS y metadatos asociados como fotografías y registros de tiempo. Para proyectos de infraestructura, esta herramienta garantiza la integridad y trazabilidad de los datos levantados.</w:t>
+        <w:t xml:space="preserve"> es una plataforma de código abierto diseñada para la recopilación de datos en campo en en</w:t>
+      </w:r>
+      <w:r>
+        <w:rPr>
+          <w:sz w:val="24"/>
+          <w:szCs w:val="24"/>
+        </w:rPr>
+        <w:t xml:space="preserve">tornos complejos. Facilita la creación de formularios digitales estructurados, permitiendo la recolección offline, captura de coordenadas GPS y metadatos asociados como fotografías y registros de tiempo. Para proyectos de infraestructura, esta herramienta </w:t>
+      </w:r>
+      <w:r>
+        <w:rPr>
+          <w:sz w:val="24"/>
+          <w:szCs w:val="24"/>
+        </w:rPr>
+        <w:t>garantiza la integridad y trazabilidad de los datos levantados.</w:t>
       </w:r>
     </w:p>
     <w:p>
@@ -344,7 +434,21 @@
           <w:sz w:val="24"/>
           <w:szCs w:val="24"/>
         </w:rPr>
-        <w:t>En el Ecuador, la iluminación exterior y el alumbrado público están regulados por documentos como la Regulación ARCONEL 005/18, que establece las directrices para el servicio de alumbrado público general, y la normativa técnica NTE INEN 069. Estas normas determinan los niveles mínimos de iluminancia, uniformidad y condiciones de diseño que deben cumplir las vías y espacios públicos para garantizar la seguridad vial y peatonal.</w:t>
+        <w:t xml:space="preserve">En el Ecuador, la iluminación exterior y el alumbrado público están regulados por documentos como la Regulación ARCONEL 005/18, que </w:t>
+      </w:r>
+      <w:r>
+        <w:rPr>
+          <w:sz w:val="24"/>
+          <w:szCs w:val="24"/>
+        </w:rPr>
+        <w:t>establece las directrices para el servicio de alumbrado público general, y la normativa técnica NTE INEN 069. Estas normas determinan los niveles mínimos de iluminancia, uniformidad y condiciones de diseño que deben cumplir las vías y espacios públicos par</w:t>
+      </w:r>
+      <w:r>
+        <w:rPr>
+          <w:sz w:val="24"/>
+          <w:szCs w:val="24"/>
+        </w:rPr>
+        <w:t>a garantizar la seguridad vial y peatonal.</w:t>
       </w:r>
     </w:p>
     <w:p>
@@ -366,7 +470,14 @@
           <w:sz w:val="24"/>
           <w:szCs w:val="24"/>
         </w:rPr>
-        <w:t xml:space="preserve">A nivel internacional, la Comisión Internacional de Iluminación (CIE) a través del documento CIE 115:2010 recomienda niveles de iluminancia para el tránsito motorizado y peatonal. Del mismo modo, la </w:t>
+        <w:t>A nivel internacional, la Comisión Internacional de Iluminación (CIE) a través del documento CIE 115:2010 recomienda niveles de iluminancia para el tránsito motorizado y p</w:t>
+      </w:r>
+      <w:r>
+        <w:rPr>
+          <w:sz w:val="24"/>
+          <w:szCs w:val="24"/>
+        </w:rPr>
+        <w:t xml:space="preserve">eatonal. Del mismo modo, la </w:t>
       </w:r>
       <w:proofErr w:type="spellStart"/>
       <w:r>
@@ -414,7 +525,14 @@
           <w:sz w:val="24"/>
           <w:szCs w:val="24"/>
         </w:rPr>
-        <w:t xml:space="preserve"> (IES) y estándares ISO proporcionan directrices para el diseño de iluminación exterior (IES RP-33), especificando requisitos para campus educativos que priorizan el confort visual, el control del deslumbramiento y la prevención de la contaminación lumínica.</w:t>
+        <w:t xml:space="preserve"> (IES) y estándares ISO proporcionan directrices para el diseño de iluminación exterior (IES RP-33), especificando requisitos para campus educativos que priorizan el confort visual, el control del</w:t>
+      </w:r>
+      <w:r>
+        <w:rPr>
+          <w:sz w:val="24"/>
+          <w:szCs w:val="24"/>
+        </w:rPr>
+        <w:t xml:space="preserve"> deslumbramiento y la prevención de la contaminación lumínica.</w:t>
       </w:r>
     </w:p>
     <w:p>
@@ -436,7 +554,14 @@
           <w:sz w:val="24"/>
           <w:szCs w:val="24"/>
         </w:rPr>
-        <w:t>Las magnitudes fotométricas son fundamentales para evaluar el desempeño de sistemas de iluminación. Incluyen la cantidad total de luz emitida, la concentración de luz en una dirección específica y la luz que incide sobre una superficie. Comprender estas variables permite dimensionar adecuadamente las instalaciones.</w:t>
+        <w:t>Las magnitudes fotométricas son fundamentales para evaluar el desempeño de sistemas de iluminación. Incluyen la cantidad total de luz emitida, la concentración de lu</w:t>
+      </w:r>
+      <w:r>
+        <w:rPr>
+          <w:sz w:val="24"/>
+          <w:szCs w:val="24"/>
+        </w:rPr>
+        <w:t>z en una dirección específica y la luz que incide sobre una superficie. Comprender estas variables permite dimensionar adecuadamente las instalaciones.</w:t>
       </w:r>
     </w:p>
     <w:p>
@@ -458,7 +583,21 @@
           <w:sz w:val="24"/>
           <w:szCs w:val="24"/>
         </w:rPr>
-        <w:t>El lux (lx) es la unidad derivada del Sistema Internacional de Unidades (SI) para la iluminancia o nivel de iluminación. Un lux equivale a un lumen por metro cuadrado. Mide el flujo luminoso que incide perpendicularmente sobre una unidad de superficie y es el indicador clave evaluado en terreno para comprobar si la luz llega adecuadamente a los usuarios.</w:t>
+        <w:t>El lux (lx) es la unidad derivada del Sistema Internacional de Unidades (SI) para la iluminancia</w:t>
+      </w:r>
+      <w:r>
+        <w:rPr>
+          <w:sz w:val="24"/>
+          <w:szCs w:val="24"/>
+        </w:rPr>
+        <w:t xml:space="preserve"> o nivel de iluminación. Un lux equivale a un lumen por metro cuadrado. Mide el flujo luminoso que incide perpendicularmente sobre una unidad de superficie y es el indicador clave evaluado en terreno para comprobar si la luz llega adecuadamente a los usuar</w:t>
+      </w:r>
+      <w:r>
+        <w:rPr>
+          <w:sz w:val="24"/>
+          <w:szCs w:val="24"/>
+        </w:rPr>
+        <w:t>ios.</w:t>
       </w:r>
     </w:p>
     <w:p>
@@ -480,7 +619,14 @@
           <w:sz w:val="24"/>
           <w:szCs w:val="24"/>
         </w:rPr>
-        <w:t>El lumen (lm) es la unidad del SI que mide el flujo luminoso; es decir, la potencia luminosa percibida o la cantidad total de luz visible emitida por una fuente. Una lámpara LED moderna puede proporcionar la misma cantidad de lúmenes que una de sodio consumiendo una fracción de la energía.</w:t>
+        <w:t>El lumen (lm) es la unidad del SI que mide el flujo luminoso; es decir, la potencia luminosa percibida o la cantidad total de luz visible emitida por una fuente. Una lámpara LED moderna puede proporcionar la misma cantidad de lúmenes que una</w:t>
+      </w:r>
+      <w:r>
+        <w:rPr>
+          <w:sz w:val="24"/>
+          <w:szCs w:val="24"/>
+        </w:rPr>
+        <w:t xml:space="preserve"> de sodio consumiendo una fracción de la energía.</w:t>
       </w:r>
     </w:p>
     <w:p>
@@ -502,7 +648,14 @@
           <w:sz w:val="24"/>
           <w:szCs w:val="24"/>
         </w:rPr>
-        <w:t>La candela (cd) es la unidad base del SI que mide la intensidad luminosa en una dirección dada. Refleja cómo la luminaria distribuye o enfoca el flujo luminoso (lúmenes) en el espacio. Las ópticas de las luminarias LED modernas dirigen eficientemente las candelas hacia donde se necesitan, reduciendo la dispersión.</w:t>
+        <w:t>La candela (cd) es la unidad base del SI que mide la intensidad luminosa en una dirección dada. Refleja cómo la luminaria distribuye o enfoca el flujo luminoso (lúmenes) en el espacio. Las óptic</w:t>
+      </w:r>
+      <w:r>
+        <w:rPr>
+          <w:sz w:val="24"/>
+          <w:szCs w:val="24"/>
+        </w:rPr>
+        <w:t>as de las luminarias LED modernas dirigen eficientemente las candelas hacia donde se necesitan, reduciendo la dispersión.</w:t>
       </w:r>
     </w:p>
     <w:p>
@@ -525,7 +678,21 @@
           <w:sz w:val="24"/>
           <w:szCs w:val="24"/>
         </w:rPr>
-        <w:t>La temperatura de color correlacionada (CCT), medida en Kelvin (K), describe la apariencia cromática de la luz. El vapor de sodio a alta presión produce una luz amarilla-anaranjada típica (aprox. 2000K-2200K) con pobre reproducción cromática (CRI). La tecnología LED permite temperaturas más neutras o frías (3000K a 5000K) que mejoran sustancialmente el reconocimiento facial y la percepción de seguridad.</w:t>
+        <w:t>La temperatura de color correlacionada (CCT), medida en Kelvin (K), describe la apariencia cromática de la lu</w:t>
+      </w:r>
+      <w:r>
+        <w:rPr>
+          <w:sz w:val="24"/>
+          <w:szCs w:val="24"/>
+        </w:rPr>
+        <w:t>z. El vapor de sodio a alta presión produce una luz amarilla-anaranjada típica (aprox. 2000K-2200K) con pobre reproducción cromática (CRI). La tecnología LED permite temperaturas más neutras o frías (3000K a 5000K) que mejoran sustancialmente el reconocimi</w:t>
+      </w:r>
+      <w:r>
+        <w:rPr>
+          <w:sz w:val="24"/>
+          <w:szCs w:val="24"/>
+        </w:rPr>
+        <w:t>ento facial y la percepción de seguridad.</w:t>
       </w:r>
     </w:p>
     <w:p>
@@ -547,7 +714,14 @@
           <w:sz w:val="24"/>
           <w:szCs w:val="24"/>
         </w:rPr>
-        <w:t>La uniformidad lumínica (U0) es la relación entre la iluminancia mínima y la iluminancia media en una superficie. Alta uniformidad significa que no hay zonas con contrastes extremos (manchas oscuras alternadas con manchas muy iluminadas), lo cual es crucial para la seguridad peatonal y la visibilidad sin fatiga visual.</w:t>
+        <w:t>La uniformidad lumínica (U0) es la relación entre la iluminancia mínima y la iluminancia media en una superficie. Alta uniformidad significa que no hay zonas con contrastes extremos (mancha</w:t>
+      </w:r>
+      <w:r>
+        <w:rPr>
+          <w:sz w:val="24"/>
+          <w:szCs w:val="24"/>
+        </w:rPr>
+        <w:t>s oscuras alternadas con manchas muy iluminadas), lo cual es crucial para la seguridad peatonal y la visibilidad sin fatiga visual.</w:t>
       </w:r>
     </w:p>
     <w:p>
@@ -569,7 +743,14 @@
           <w:sz w:val="24"/>
           <w:szCs w:val="24"/>
         </w:rPr>
-        <w:t>Los Diodos Emisores de Luz (LED) representan la tecnología de iluminación de estado sólido más eficiente en la actualidad. Tienen una alta eficacia luminosa (superando los 130-150 lm/W), encendido instantáneo, capacidad de atenuación (</w:t>
+        <w:t xml:space="preserve">Los Diodos Emisores de Luz (LED) representan la tecnología de iluminación de estado sólido más </w:t>
+      </w:r>
+      <w:r>
+        <w:rPr>
+          <w:sz w:val="24"/>
+          <w:szCs w:val="24"/>
+        </w:rPr>
+        <w:t>eficiente en la actualidad. Tienen una alta eficacia luminosa (superando los 130-150 lm/W), encendido instantáneo, capacidad de atenuación (</w:t>
       </w:r>
       <w:proofErr w:type="spellStart"/>
       <w:r>
@@ -585,7 +766,14 @@
           <w:sz w:val="24"/>
           <w:szCs w:val="24"/>
         </w:rPr>
-        <w:t>), y un alto Índice de Reproducción Cromática (CRI). Su vida útil puede sobrepasar las 50,000 a 100,000 horas, requiriendo un mantenimiento mínimo.</w:t>
+        <w:t>), y un alto Índice de Reproducción Cromática (CRI). Su vida útil puede sobrepasar las 50,000 a 100,000 horas</w:t>
+      </w:r>
+      <w:r>
+        <w:rPr>
+          <w:sz w:val="24"/>
+          <w:szCs w:val="24"/>
+        </w:rPr>
+        <w:t>, requiriendo un mantenimiento mínimo.</w:t>
       </w:r>
     </w:p>
     <w:p>
@@ -607,7 +795,14 @@
           <w:sz w:val="24"/>
           <w:szCs w:val="24"/>
         </w:rPr>
-        <w:t>Las lámparas de Vapor de Sodio de Alta Presión (SAP) han sido el estándar del alumbrado exterior por décadas debido a su buena eficacia en lúmenes brutos. Sin embargo, sufren de degradación rápida del flujo luminoso, requieren balastos, tardan minutos en alcanzar su brillo máximo, contienen metales pesados contaminantes y distorsionan drásticamente los colores (CRI bajo).</w:t>
+        <w:t>Las lámparas de Vapor de Sodio de Alta Presión (SAP) han sido el estándar del alumbrado exterior por décadas debido a su buena eficacia en lúmenes brutos. Sin embargo, sufren de degradación rápi</w:t>
+      </w:r>
+      <w:r>
+        <w:rPr>
+          <w:sz w:val="24"/>
+          <w:szCs w:val="24"/>
+        </w:rPr>
+        <w:t>da del flujo luminoso, requieren balastos, tardan minutos en alcanzar su brillo máximo, contienen metales pesados contaminantes y distorsionan drásticamente los colores (CRI bajo).</w:t>
       </w:r>
     </w:p>
     <w:p>
@@ -629,7 +824,21 @@
           <w:sz w:val="24"/>
           <w:szCs w:val="24"/>
         </w:rPr>
-        <w:t>La seguridad eléctrica abarca las normativas y prácticas para prevenir descargas eléctricas, cortocircuitos e incendios. En infraestructura antigua a la intemperie, factores como la degradación del aislamiento, las conexiones deficientes y la falta de puestas a tierra adecuadas presentan un riesgo constante para transeúntes y personal de mantenimiento.</w:t>
+        <w:t>La seguridad eléctrica abarca las normativas y prá</w:t>
+      </w:r>
+      <w:r>
+        <w:rPr>
+          <w:sz w:val="24"/>
+          <w:szCs w:val="24"/>
+        </w:rPr>
+        <w:t>cticas para prevenir descargas eléctricas, cortocircuitos e incendios. En infraestructura antigua a la intemperie, factores como la degradación del aislamiento, las conexiones deficientes y la falta de puestas a tierra adecuadas presentan un riesgo constan</w:t>
+      </w:r>
+      <w:r>
+        <w:rPr>
+          <w:sz w:val="24"/>
+          <w:szCs w:val="24"/>
+        </w:rPr>
+        <w:t>te para transeúntes y personal de mantenimiento.</w:t>
       </w:r>
     </w:p>
     <w:p>
@@ -651,7 +860,14 @@
           <w:sz w:val="24"/>
           <w:szCs w:val="24"/>
         </w:rPr>
-        <w:t>El cableado expuesto o tendido de forma improvisada es una de las vulnerabilidades más comunes en infraestructuras obsoletas. No solo infringe los códigos de instalación eléctrica, sino que expone los conductores a desgaste mecánico, vandalismo, radiación UV e ingreso de agua, derivando frecuentemente en fallas del sistema o riesgos letales.</w:t>
+        <w:t>El cableado expuesto o tendido de forma improvisada es una de las vulnerabilidades más comunes en infraestructuras obsoletas. No solo infringe los códigos de instalación eléctrica, sin</w:t>
+      </w:r>
+      <w:r>
+        <w:rPr>
+          <w:sz w:val="24"/>
+          <w:szCs w:val="24"/>
+        </w:rPr>
+        <w:t>o que expone los conductores a desgaste mecánico, vandalismo, radiación UV e ingreso de agua, derivando frecuentemente en fallas del sistema o riesgos letales.</w:t>
       </w:r>
     </w:p>
     <w:p>
@@ -673,7 +889,14 @@
           <w:sz w:val="24"/>
           <w:szCs w:val="24"/>
         </w:rPr>
-        <w:t xml:space="preserve">Los Sistemas de Información Geográfica (GIS) permiten capturar, almacenar, manipular, analizar y visualizar datos con atributos espaciales. En la gestión de luminarias, un SIG permite </w:t>
+        <w:t>Los Sistemas de Información Geográfica (GIS) permiten capturar, almacenar, man</w:t>
+      </w:r>
+      <w:r>
+        <w:rPr>
+          <w:sz w:val="24"/>
+          <w:szCs w:val="24"/>
+        </w:rPr>
+        <w:t xml:space="preserve">ipular, analizar y visualizar datos con atributos espaciales. En la gestión de luminarias, un SIG permite </w:t>
       </w:r>
       <w:r>
         <w:rPr>
@@ -690,20 +913,30 @@
         <w:spacing w:after="200"/>
       </w:pPr>
       <w:r>
-        <w:t>3.15 Gestión de activos</w:t>
-      </w:r>
-    </w:p>
-    <w:p>
-      <w:pPr>
-        <w:spacing w:after="200"/>
-        <w:jc w:val="both"/>
-      </w:pPr>
-      <w:r>
-        <w:rPr>
-          <w:sz w:val="24"/>
-          <w:szCs w:val="24"/>
-        </w:rPr>
-        <w:t>La gestión de activos físicos en infraestructura tecnológica se refiere al ciclo de vida de los equipos (compra, instalación, mantenimiento y baja). Un inventario etiquetado y georreferenciado de luminarias es el núcleo de una gestión de activos eficiente, reduciendo tiempos de respuesta y optimizando el inventario de repuestos.</w:t>
+        <w:t>3.15 Gest</w:t>
+      </w:r>
+      <w:r>
+        <w:t>ión de activos</w:t>
+      </w:r>
+    </w:p>
+    <w:p>
+      <w:pPr>
+        <w:spacing w:after="200"/>
+        <w:jc w:val="both"/>
+      </w:pPr>
+      <w:r>
+        <w:rPr>
+          <w:sz w:val="24"/>
+          <w:szCs w:val="24"/>
+        </w:rPr>
+        <w:t>La gestión de activos físicos en infraestructura tecnológica se refiere al ciclo de vida de los equipos (compra, instalación, mantenimiento y baja). Un inventario etiquetado y georreferenciado de luminarias es el núcleo de una gestión de act</w:t>
+      </w:r>
+      <w:r>
+        <w:rPr>
+          <w:sz w:val="24"/>
+          <w:szCs w:val="24"/>
+        </w:rPr>
+        <w:t>ivos eficiente, reduciendo tiempos de respuesta y optimizando el inventario de repuestos.</w:t>
       </w:r>
     </w:p>
     <w:p>
@@ -725,7 +958,14 @@
           <w:sz w:val="24"/>
           <w:szCs w:val="24"/>
         </w:rPr>
-        <w:t>Los campus universitarios actúan como pequeñas ciudades con requerimientos específicos de infraestructura, combinando redes viales internas, zonas peatonales, plazas y espacios deportivos. Su iluminación debe ser escalable, segura y contribuir al confort de una comunidad diversa, operando con presupuestos restringidos de fondos públicos.</w:t>
+        <w:t xml:space="preserve">Los campus universitarios actúan como pequeñas ciudades con requerimientos específicos de infraestructura, combinando redes </w:t>
+      </w:r>
+      <w:r>
+        <w:rPr>
+          <w:sz w:val="24"/>
+          <w:szCs w:val="24"/>
+        </w:rPr>
+        <w:t>viales internas, zonas peatonales, plazas y espacios deportivos. Su iluminación debe ser escalable, segura y contribuir al confort de una comunidad diversa, operando con presupuestos restringidos de fondos públicos.</w:t>
       </w:r>
     </w:p>
     <w:p>
@@ -747,7 +987,21 @@
           <w:sz w:val="24"/>
           <w:szCs w:val="24"/>
         </w:rPr>
-        <w:t>La eficiencia energética consiste en reducir la cantidad de energía requerida para proporcionar los mismos productos o servicios. En iluminación, esto se logra mejorando la eficacia de la luminaria (lm/W) y utilizando controladores ópticos para no desperdiciar luz. Un recambio tecnológico puede reducir el consumo energético en más del 50%.</w:t>
+        <w:t>La eficiencia</w:t>
+      </w:r>
+      <w:r>
+        <w:rPr>
+          <w:sz w:val="24"/>
+          <w:szCs w:val="24"/>
+        </w:rPr>
+        <w:t xml:space="preserve"> energética consiste en reducir la cantidad de energía requerida para proporcionar los mismos productos o servicios. En iluminación, esto se logra mejorando la eficacia de la luminaria (lm/W) y utilizando controladores ópticos para no desperdiciar luz. Un </w:t>
+      </w:r>
+      <w:r>
+        <w:rPr>
+          <w:sz w:val="24"/>
+          <w:szCs w:val="24"/>
+        </w:rPr>
+        <w:t>recambio tecnológico puede reducir el consumo energético en más del 50%.</w:t>
       </w:r>
     </w:p>
     <w:p>
@@ -769,7 +1023,14 @@
           <w:sz w:val="24"/>
           <w:szCs w:val="24"/>
         </w:rPr>
-        <w:t>Las tecnologías convencionales generan impactos ambientales severos tanto en su manufactura (uso de vapor de mercurio y sodio) como en su alta huella de carbono operativa por consumo de electricidad. Además, su pobre control óptico incrementa la contaminación lumínica (</w:t>
+        <w:t>Las tecnologías convencionales generan impactos ambientales severos tanto en su manufactura (uso de vapor de mercurio y sodio) com</w:t>
+      </w:r>
+      <w:r>
+        <w:rPr>
+          <w:sz w:val="24"/>
+          <w:szCs w:val="24"/>
+        </w:rPr>
+        <w:t>o en su alta huella de carbono operativa por consumo de electricidad. Además, su pobre control óptico incrementa la contaminación lumínica (</w:t>
       </w:r>
       <w:proofErr w:type="spellStart"/>
       <w:r>
@@ -817,7 +1078,14 @@
           <w:sz w:val="24"/>
           <w:szCs w:val="24"/>
         </w:rPr>
-        <w:t xml:space="preserve"> de insectos y disrupción de ciclos en flora y fauna).</w:t>
+        <w:t xml:space="preserve"> de insectos y disrupción de ciclos en flo</w:t>
+      </w:r>
+      <w:r>
+        <w:rPr>
+          <w:sz w:val="24"/>
+          <w:szCs w:val="24"/>
+        </w:rPr>
+        <w:t>ra y fauna).</w:t>
       </w:r>
     </w:p>
     <w:p>
@@ -839,7 +1107,14 @@
           <w:sz w:val="24"/>
           <w:szCs w:val="24"/>
         </w:rPr>
-        <w:t>Los costos operativos (OPEX) de iluminación se dominan por el pago de la tarifa eléctrica. Este costo se calcula considerando la potencia de la luminaria más las pérdidas del balasto, multiplicado por las horas de operación anuales (aprox. 4,380 horas/año) y por el costo de la energía (USD/kWh).</w:t>
+        <w:t>Los costos operativos (OPEX) de iluminación se dominan por el pago de la tarifa eléctrica. Este costo se calcula considerando la potencia de la luminaria más las pérdidas del balasto, multiplicado por las horas de oper</w:t>
+      </w:r>
+      <w:r>
+        <w:rPr>
+          <w:sz w:val="24"/>
+          <w:szCs w:val="24"/>
+        </w:rPr>
+        <w:t>ación anuales (aprox. 4,380 horas/año) y por el costo de la energía (USD/kWh).</w:t>
       </w:r>
     </w:p>
     <w:p>
@@ -877,7 +1152,14 @@
           <w:sz w:val="24"/>
           <w:szCs w:val="24"/>
         </w:rPr>
-        <w:t>, balastos, condensadores). La corta vida de las lámparas de sodio obliga a rutinas de recambio bianuales, incrementando considerablemente los gastos logísticos en comparación con el LED.</w:t>
+        <w:t>, balastos</w:t>
+      </w:r>
+      <w:r>
+        <w:rPr>
+          <w:sz w:val="24"/>
+          <w:szCs w:val="24"/>
+        </w:rPr>
+        <w:t>, condensadores). La corta vida de las lámparas de sodio obliga a rutinas de recambio bianuales, incrementando considerablemente los gastos logísticos en comparación con el LED.</w:t>
       </w:r>
     </w:p>
     <w:p>
@@ -931,7 +1213,14 @@
           <w:sz w:val="24"/>
           <w:szCs w:val="24"/>
         </w:rPr>
-        <w:t xml:space="preserve"> (tiempo de recuperación) evalúan el beneficio financiero de una actualización. Miden en cuánto tiempo los ahorros generados por </w:t>
+        <w:t xml:space="preserve"> (t</w:t>
+      </w:r>
+      <w:r>
+        <w:rPr>
+          <w:sz w:val="24"/>
+          <w:szCs w:val="24"/>
+        </w:rPr>
+        <w:t xml:space="preserve">iempo de recuperación) evalúan el beneficio financiero de una actualización. Miden en cuánto tiempo los ahorros generados por </w:t>
       </w:r>
       <w:r>
         <w:rPr>
@@ -948,7 +1237,10 @@
         <w:spacing w:before="300"/>
       </w:pPr>
       <w:r>
-        <w:t>4. METODOLOGÍA</w:t>
+        <w:t>4. ME</w:t>
+      </w:r>
+      <w:r>
+        <w:t>TODOLOGÍA</w:t>
       </w:r>
     </w:p>
     <w:p>
@@ -970,7 +1262,14 @@
           <w:sz w:val="24"/>
           <w:szCs w:val="24"/>
         </w:rPr>
-        <w:t>Se empleó un diseño de investigación descriptivo, de campo y cuantitativo. Descriptivo porque se documentaron las características del sistema actual; de campo ya que la recolección se efectuó in situ en el campus de la UCE; y cuantitativo puesto que se recolectaron magnitudes numéricas (coordenadas, luxes, alturas).</w:t>
+        <w:t>Se empleó un diseño de investigación descriptivo, de campo y cuantitativo. Descriptivo porque se documentaron las características del sistema actual; de campo ya que la recolección se efectuó in situ en el campus de la U</w:t>
+      </w:r>
+      <w:r>
+        <w:rPr>
+          <w:sz w:val="24"/>
+          <w:szCs w:val="24"/>
+        </w:rPr>
+        <w:t>CE; y cuantitativo puesto que se recolectaron magnitudes numéricas (coordenadas, luxes, alturas).</w:t>
       </w:r>
     </w:p>
     <w:p>
@@ -1000,7 +1299,14 @@
           <w:sz w:val="24"/>
           <w:szCs w:val="24"/>
         </w:rPr>
-        <w:t>m.s.n.m</w:t>
+        <w:t>m.s.</w:t>
+      </w:r>
+      <w:r>
+        <w:rPr>
+          <w:sz w:val="24"/>
+          <w:szCs w:val="24"/>
+        </w:rPr>
+        <w:t>n.m</w:t>
       </w:r>
       <w:proofErr w:type="spellEnd"/>
       <w:r>
@@ -1030,7 +1336,14 @@
           <w:sz w:val="24"/>
           <w:szCs w:val="24"/>
         </w:rPr>
-        <w:t>El levantamiento de campo, consolidación de la información y análisis técnico fue realizado por los miembros asignados al Grupo 3, en el marco de la asignatura Infraestructura de la Información II.</w:t>
+        <w:t>El levantamiento de campo, consolidación de la información y análisis técnico fue realizado por lo</w:t>
+      </w:r>
+      <w:r>
+        <w:rPr>
+          <w:sz w:val="24"/>
+          <w:szCs w:val="24"/>
+        </w:rPr>
+        <w:t>s miembros asignados al Grupo 3, en el marco de la asignatura Infraestructura de la Información II.</w:t>
       </w:r>
     </w:p>
     <w:p>
@@ -1065,7 +1378,14 @@
           <w:sz w:val="24"/>
           <w:szCs w:val="24"/>
         </w:rPr>
-        <w:t>• Receptor GPS de dispositivos móviles con precisión submétrica (&lt; 5 m a cielo abierto).</w:t>
+        <w:t>• Receptor GPS de dispo</w:t>
+      </w:r>
+      <w:r>
+        <w:rPr>
+          <w:sz w:val="24"/>
+          <w:szCs w:val="24"/>
+        </w:rPr>
+        <w:t>sitivos móviles con precisión submétrica (&lt; 5 m a cielo abierto).</w:t>
       </w:r>
     </w:p>
     <w:p>
@@ -1132,7 +1452,21 @@
           <w:sz w:val="24"/>
           <w:szCs w:val="24"/>
         </w:rPr>
-        <w:t>Los brigadistas recorrieron cada facultad asignada durante horario vespertino y nocturno. Para cada luminaria física (poste o adosada) se capturó la coordenada GPS, se estimó la altura, se caracterizó la tecnología (Sodio/LED), y se midió la incidencia lumínica en la superficie de circulación directamente debajo de la luminaria. Se tomaron además fotografías de evidencia.</w:t>
+        <w:t>Los brigadistas recorrieron cada facultad asignada durante horario vespertino y noctur</w:t>
+      </w:r>
+      <w:r>
+        <w:rPr>
+          <w:sz w:val="24"/>
+          <w:szCs w:val="24"/>
+        </w:rPr>
+        <w:t xml:space="preserve">no. Para cada luminaria física (poste o adosada) se capturó la coordenada GPS, se estimó la altura, se caracterizó la tecnología (Sodio/LED), y se midió la incidencia lumínica en la superficie de circulación directamente debajo de la luminaria. Se tomaron </w:t>
+      </w:r>
+      <w:r>
+        <w:rPr>
+          <w:sz w:val="24"/>
+          <w:szCs w:val="24"/>
+        </w:rPr>
+        <w:t>además fotografías de evidencia.</w:t>
       </w:r>
     </w:p>
     <w:p>
@@ -1231,7 +1565,14 @@
           <w:sz w:val="24"/>
           <w:szCs w:val="24"/>
         </w:rPr>
-        <w:t>El análisis estadístico se efectuó mediante técnicas de estadística descriptiva. Se generaron tablas de frecuencia absoluta y relativa para variables categóricas, y se calcularon medidas de tendencia central y dispersión para variables continuas (luxes).</w:t>
+        <w:t>El análisi</w:t>
+      </w:r>
+      <w:r>
+        <w:rPr>
+          <w:sz w:val="24"/>
+          <w:szCs w:val="24"/>
+        </w:rPr>
+        <w:t>s estadístico se efectuó mediante técnicas de estadística descriptiva. Se generaron tablas de frecuencia absoluta y relativa para variables categóricas, y se calcularon medidas de tendencia central y dispersión para variables continuas (luxes).</w:t>
       </w:r>
     </w:p>
     <w:p>
@@ -1240,7 +1581,10 @@
         <w:spacing w:after="200"/>
       </w:pPr>
       <w:r>
-        <w:t>4.9 Métodos GIS</w:t>
+        <w:t>4.9 Métodos</w:t>
+      </w:r>
+      <w:r>
+        <w:t xml:space="preserve"> GIS</w:t>
       </w:r>
     </w:p>
     <w:p>
@@ -1269,7 +1613,14 @@
           <w:sz w:val="24"/>
           <w:szCs w:val="24"/>
         </w:rPr>
-        <w:t xml:space="preserve"> y Pandas para renderizar cartografía interactiva HTML. El análisis geográfico incluye agrupación semántica, diferenciación de marcadores y la generación de un mapa de calor ponderado por la variable de iluminancia.</w:t>
+        <w:t xml:space="preserve"> y Pandas para renderizar cartografía interactiva HTML. El análisis geográfico incluye agrupación semántica, diferenciación de marcadores y la generación de un mapa de calor ponderado</w:t>
+      </w:r>
+      <w:r>
+        <w:rPr>
+          <w:sz w:val="24"/>
+          <w:szCs w:val="24"/>
+        </w:rPr>
+        <w:t xml:space="preserve"> por la variable de iluminancia.</w:t>
       </w:r>
     </w:p>
     <w:p>
@@ -1335,12 +1686,6 @@
         <w:gridCol w:w="2177"/>
       </w:tblGrid>
       <w:tr>
-        <w:tblPrEx>
-          <w:tblCellMar>
-            <w:top w:w="0" w:type="dxa"/>
-            <w:bottom w:w="0" w:type="dxa"/>
-          </w:tblCellMar>
-        </w:tblPrEx>
         <w:tc>
           <w:tcPr>
             <w:tcW w:w="0" w:type="auto"/>
@@ -1406,12 +1751,6 @@
         </w:tc>
       </w:tr>
       <w:tr>
-        <w:tblPrEx>
-          <w:tblCellMar>
-            <w:top w:w="0" w:type="dxa"/>
-            <w:bottom w:w="0" w:type="dxa"/>
-          </w:tblCellMar>
-        </w:tblPrEx>
         <w:tc>
           <w:tcPr>
             <w:tcW w:w="0" w:type="auto"/>
@@ -1462,12 +1801,6 @@
         </w:tc>
       </w:tr>
       <w:tr>
-        <w:tblPrEx>
-          <w:tblCellMar>
-            <w:top w:w="0" w:type="dxa"/>
-            <w:bottom w:w="0" w:type="dxa"/>
-          </w:tblCellMar>
-        </w:tblPrEx>
         <w:tc>
           <w:tcPr>
             <w:tcW w:w="0" w:type="auto"/>
@@ -1518,12 +1851,6 @@
         </w:tc>
       </w:tr>
       <w:tr>
-        <w:tblPrEx>
-          <w:tblCellMar>
-            <w:top w:w="0" w:type="dxa"/>
-            <w:bottom w:w="0" w:type="dxa"/>
-          </w:tblCellMar>
-        </w:tblPrEx>
         <w:tc>
           <w:tcPr>
             <w:tcW w:w="0" w:type="auto"/>
@@ -1574,12 +1901,6 @@
         </w:tc>
       </w:tr>
       <w:tr>
-        <w:tblPrEx>
-          <w:tblCellMar>
-            <w:top w:w="0" w:type="dxa"/>
-            <w:bottom w:w="0" w:type="dxa"/>
-          </w:tblCellMar>
-        </w:tblPrEx>
         <w:tc>
           <w:tcPr>
             <w:tcW w:w="0" w:type="auto"/>
@@ -1630,12 +1951,6 @@
         </w:tc>
       </w:tr>
       <w:tr>
-        <w:tblPrEx>
-          <w:tblCellMar>
-            <w:top w:w="0" w:type="dxa"/>
-            <w:bottom w:w="0" w:type="dxa"/>
-          </w:tblCellMar>
-        </w:tblPrEx>
         <w:tc>
           <w:tcPr>
             <w:tcW w:w="0" w:type="auto"/>
@@ -1686,12 +2001,6 @@
         </w:tc>
       </w:tr>
       <w:tr>
-        <w:tblPrEx>
-          <w:tblCellMar>
-            <w:top w:w="0" w:type="dxa"/>
-            <w:bottom w:w="0" w:type="dxa"/>
-          </w:tblCellMar>
-        </w:tblPrEx>
         <w:tc>
           <w:tcPr>
             <w:tcW w:w="0" w:type="auto"/>
@@ -1780,12 +2089,6 @@
         <w:gridCol w:w="3728"/>
       </w:tblGrid>
       <w:tr>
-        <w:tblPrEx>
-          <w:tblCellMar>
-            <w:top w:w="0" w:type="dxa"/>
-            <w:bottom w:w="0" w:type="dxa"/>
-          </w:tblCellMar>
-        </w:tblPrEx>
         <w:tc>
           <w:tcPr>
             <w:tcW w:w="0" w:type="auto"/>
@@ -1851,12 +2154,6 @@
         </w:tc>
       </w:tr>
       <w:tr>
-        <w:tblPrEx>
-          <w:tblCellMar>
-            <w:top w:w="0" w:type="dxa"/>
-            <w:bottom w:w="0" w:type="dxa"/>
-          </w:tblCellMar>
-        </w:tblPrEx>
         <w:tc>
           <w:tcPr>
             <w:tcW w:w="0" w:type="auto"/>
@@ -1907,12 +2204,6 @@
         </w:tc>
       </w:tr>
       <w:tr>
-        <w:tblPrEx>
-          <w:tblCellMar>
-            <w:top w:w="0" w:type="dxa"/>
-            <w:bottom w:w="0" w:type="dxa"/>
-          </w:tblCellMar>
-        </w:tblPrEx>
         <w:tc>
           <w:tcPr>
             <w:tcW w:w="0" w:type="auto"/>
@@ -2001,12 +2292,6 @@
         <w:gridCol w:w="3296"/>
       </w:tblGrid>
       <w:tr>
-        <w:tblPrEx>
-          <w:tblCellMar>
-            <w:top w:w="0" w:type="dxa"/>
-            <w:bottom w:w="0" w:type="dxa"/>
-          </w:tblCellMar>
-        </w:tblPrEx>
         <w:tc>
           <w:tcPr>
             <w:tcW w:w="0" w:type="auto"/>
@@ -2073,12 +2358,6 @@
         </w:tc>
       </w:tr>
       <w:tr>
-        <w:tblPrEx>
-          <w:tblCellMar>
-            <w:top w:w="0" w:type="dxa"/>
-            <w:bottom w:w="0" w:type="dxa"/>
-          </w:tblCellMar>
-        </w:tblPrEx>
         <w:tc>
           <w:tcPr>
             <w:tcW w:w="0" w:type="auto"/>
@@ -2129,12 +2408,6 @@
         </w:tc>
       </w:tr>
       <w:tr>
-        <w:tblPrEx>
-          <w:tblCellMar>
-            <w:top w:w="0" w:type="dxa"/>
-            <w:bottom w:w="0" w:type="dxa"/>
-          </w:tblCellMar>
-        </w:tblPrEx>
         <w:tc>
           <w:tcPr>
             <w:tcW w:w="0" w:type="auto"/>
@@ -2185,12 +2458,6 @@
         </w:tc>
       </w:tr>
       <w:tr>
-        <w:tblPrEx>
-          <w:tblCellMar>
-            <w:top w:w="0" w:type="dxa"/>
-            <w:bottom w:w="0" w:type="dxa"/>
-          </w:tblCellMar>
-        </w:tblPrEx>
         <w:tc>
           <w:tcPr>
             <w:tcW w:w="0" w:type="auto"/>
@@ -2278,12 +2545,6 @@
         <w:gridCol w:w="3439"/>
       </w:tblGrid>
       <w:tr>
-        <w:tblPrEx>
-          <w:tblCellMar>
-            <w:top w:w="0" w:type="dxa"/>
-            <w:bottom w:w="0" w:type="dxa"/>
-          </w:tblCellMar>
-        </w:tblPrEx>
         <w:tc>
           <w:tcPr>
             <w:tcW w:w="0" w:type="auto"/>
@@ -2328,12 +2589,6 @@
         </w:tc>
       </w:tr>
       <w:tr>
-        <w:tblPrEx>
-          <w:tblCellMar>
-            <w:top w:w="0" w:type="dxa"/>
-            <w:bottom w:w="0" w:type="dxa"/>
-          </w:tblCellMar>
-        </w:tblPrEx>
         <w:tc>
           <w:tcPr>
             <w:tcW w:w="0" w:type="auto"/>
@@ -2368,12 +2623,6 @@
         </w:tc>
       </w:tr>
       <w:tr>
-        <w:tblPrEx>
-          <w:tblCellMar>
-            <w:top w:w="0" w:type="dxa"/>
-            <w:bottom w:w="0" w:type="dxa"/>
-          </w:tblCellMar>
-        </w:tblPrEx>
         <w:tc>
           <w:tcPr>
             <w:tcW w:w="0" w:type="auto"/>
@@ -2408,12 +2657,6 @@
         </w:tc>
       </w:tr>
       <w:tr>
-        <w:tblPrEx>
-          <w:tblCellMar>
-            <w:top w:w="0" w:type="dxa"/>
-            <w:bottom w:w="0" w:type="dxa"/>
-          </w:tblCellMar>
-        </w:tblPrEx>
         <w:tc>
           <w:tcPr>
             <w:tcW w:w="0" w:type="auto"/>
@@ -2448,12 +2691,6 @@
         </w:tc>
       </w:tr>
       <w:tr>
-        <w:tblPrEx>
-          <w:tblCellMar>
-            <w:top w:w="0" w:type="dxa"/>
-            <w:bottom w:w="0" w:type="dxa"/>
-          </w:tblCellMar>
-        </w:tblPrEx>
         <w:tc>
           <w:tcPr>
             <w:tcW w:w="0" w:type="auto"/>
@@ -2488,12 +2725,6 @@
         </w:tc>
       </w:tr>
       <w:tr>
-        <w:tblPrEx>
-          <w:tblCellMar>
-            <w:top w:w="0" w:type="dxa"/>
-            <w:bottom w:w="0" w:type="dxa"/>
-          </w:tblCellMar>
-        </w:tblPrEx>
         <w:tc>
           <w:tcPr>
             <w:tcW w:w="0" w:type="auto"/>
@@ -2565,12 +2796,6 @@
         <w:gridCol w:w="2494"/>
       </w:tblGrid>
       <w:tr>
-        <w:tblPrEx>
-          <w:tblCellMar>
-            <w:top w:w="0" w:type="dxa"/>
-            <w:bottom w:w="0" w:type="dxa"/>
-          </w:tblCellMar>
-        </w:tblPrEx>
         <w:tc>
           <w:tcPr>
             <w:tcW w:w="0" w:type="auto"/>
@@ -2615,12 +2840,6 @@
         </w:tc>
       </w:tr>
       <w:tr>
-        <w:tblPrEx>
-          <w:tblCellMar>
-            <w:top w:w="0" w:type="dxa"/>
-            <w:bottom w:w="0" w:type="dxa"/>
-          </w:tblCellMar>
-        </w:tblPrEx>
         <w:tc>
           <w:tcPr>
             <w:tcW w:w="0" w:type="auto"/>
@@ -2655,25 +2874,22 @@
         </w:tc>
       </w:tr>
       <w:tr>
-        <w:tblPrEx>
-          <w:tblCellMar>
-            <w:top w:w="0" w:type="dxa"/>
-            <w:bottom w:w="0" w:type="dxa"/>
-          </w:tblCellMar>
-        </w:tblPrEx>
-        <w:tc>
-          <w:tcPr>
-            <w:tcW w:w="0" w:type="auto"/>
-            <w:tcMar>
-              <w:top w:w="100" w:type="dxa"/>
-              <w:left w:w="100" w:type="dxa"/>
-              <w:bottom w:w="100" w:type="dxa"/>
-              <w:right w:w="100" w:type="dxa"/>
-            </w:tcMar>
-          </w:tcPr>
-          <w:p>
-            <w:r>
-              <w:t>1 - 20 lux</w:t>
+        <w:tc>
+          <w:tcPr>
+            <w:tcW w:w="0" w:type="auto"/>
+            <w:tcMar>
+              <w:top w:w="100" w:type="dxa"/>
+              <w:left w:w="100" w:type="dxa"/>
+              <w:bottom w:w="100" w:type="dxa"/>
+              <w:right w:w="100" w:type="dxa"/>
+            </w:tcMar>
+          </w:tcPr>
+          <w:p>
+            <w:r>
+              <w:t xml:space="preserve">1 - </w:t>
+            </w:r>
+            <w:r>
+              <w:t>20 lux</w:t>
             </w:r>
           </w:p>
         </w:tc>
@@ -2695,12 +2911,6 @@
         </w:tc>
       </w:tr>
       <w:tr>
-        <w:tblPrEx>
-          <w:tblCellMar>
-            <w:top w:w="0" w:type="dxa"/>
-            <w:bottom w:w="0" w:type="dxa"/>
-          </w:tblCellMar>
-        </w:tblPrEx>
         <w:tc>
           <w:tcPr>
             <w:tcW w:w="0" w:type="auto"/>
@@ -2735,12 +2945,6 @@
         </w:tc>
       </w:tr>
       <w:tr>
-        <w:tblPrEx>
-          <w:tblCellMar>
-            <w:top w:w="0" w:type="dxa"/>
-            <w:bottom w:w="0" w:type="dxa"/>
-          </w:tblCellMar>
-        </w:tblPrEx>
         <w:tc>
           <w:tcPr>
             <w:tcW w:w="0" w:type="auto"/>
@@ -2775,12 +2979,6 @@
         </w:tc>
       </w:tr>
       <w:tr>
-        <w:tblPrEx>
-          <w:tblCellMar>
-            <w:top w:w="0" w:type="dxa"/>
-            <w:bottom w:w="0" w:type="dxa"/>
-          </w:tblCellMar>
-        </w:tblPrEx>
         <w:tc>
           <w:tcPr>
             <w:tcW w:w="0" w:type="auto"/>
@@ -2849,20 +3047,30 @@
         <w:spacing w:after="200"/>
       </w:pPr>
       <w:r>
-        <w:t>5.9 Distribución geográfica</w:t>
-      </w:r>
-    </w:p>
-    <w:p>
-      <w:pPr>
-        <w:spacing w:after="200"/>
-        <w:jc w:val="both"/>
-      </w:pPr>
-      <w:r>
-        <w:rPr>
-          <w:sz w:val="24"/>
-          <w:szCs w:val="24"/>
-        </w:rPr>
-        <w:t>Las coordenadas analizadas se concentran en una latitud media de -0.198 y longitud -78.502, ubicadas en el campus central de la Universidad en Quito. Existe una clara correlación entre la disposición de la infraestructura vial interna y el espaciamiento de postes.</w:t>
+        <w:t xml:space="preserve">5.9 </w:t>
+      </w:r>
+      <w:r>
+        <w:t>Distribución geográfica</w:t>
+      </w:r>
+    </w:p>
+    <w:p>
+      <w:pPr>
+        <w:spacing w:after="200"/>
+        <w:jc w:val="both"/>
+      </w:pPr>
+      <w:r>
+        <w:rPr>
+          <w:sz w:val="24"/>
+          <w:szCs w:val="24"/>
+        </w:rPr>
+        <w:t>Las coordenadas analizadas se concentran en una latitud media de -0.198 y longitud -78.502, ubicadas en el campus central de la Universidad en Quito. Existe una clara correlación entre la disposición de la infraestructura vial inter</w:t>
+      </w:r>
+      <w:r>
+        <w:rPr>
+          <w:sz w:val="24"/>
+          <w:szCs w:val="24"/>
+        </w:rPr>
+        <w:t>na y el espaciamiento de postes.</w:t>
       </w:r>
     </w:p>
     <w:p>
@@ -2885,7 +3093,14 @@
           <w:szCs w:val="24"/>
         </w:rPr>
         <w:lastRenderedPageBreak/>
-        <w:t>Se detectaron 2 luminarias que no emiten ninguna cantidad de luz mensurable (0 lux) y 50 que no pudieron ser medidas (asociado predominantemente a elementos apagados). Estas conforman áreas de riesgo de seguridad significativas en los senderos peatonales.</w:t>
+        <w:t>Se detectaron 2 luminarias que no emiten ninguna cantidad de luz mensurable (0 lux) y 50 que no pudieron ser medidas (asociado predominantemente a elementos apagados). Estas conforman áreas de riesgo de s</w:t>
+      </w:r>
+      <w:r>
+        <w:rPr>
+          <w:sz w:val="24"/>
+          <w:szCs w:val="24"/>
+        </w:rPr>
+        <w:t>eguridad significativas en los senderos peatonales.</w:t>
       </w:r>
     </w:p>
     <w:p>
@@ -2907,7 +3122,14 @@
           <w:sz w:val="24"/>
           <w:szCs w:val="24"/>
         </w:rPr>
-        <w:t>La matriz de recolección arroja un nivel de falla severa: 56 luminarias están defectuosas, parpadean o definitivamente no encienden. Esto representa el 37.58% del total analizado. Adicionalmente, el registro fotográfico evidencia un marcado envejecimiento de los soportes y problemas de cableado exterior suelto.</w:t>
+        <w:t>La matriz de recolección arroja un nivel de falla severa: 56 luminarias están defectuosas, parpadean o definitivamente no encienden. Esto representa el</w:t>
+      </w:r>
+      <w:r>
+        <w:rPr>
+          <w:sz w:val="24"/>
+          <w:szCs w:val="24"/>
+        </w:rPr>
+        <w:t xml:space="preserve"> 37.58% del total analizado. Adicionalmente, el registro fotográfico evidencia un marcado envejecimiento de los soportes y problemas de cableado exterior suelto.</w:t>
       </w:r>
     </w:p>
     <w:p>
@@ -2929,7 +3151,14 @@
           <w:sz w:val="24"/>
           <w:szCs w:val="24"/>
         </w:rPr>
-        <w:t xml:space="preserve">Basado en el procesamiento de los datos brutos de la medición de campo, a </w:t>
+        <w:t>Basado en el procesamiento de los datos brutos de la medición de campo</w:t>
+      </w:r>
+      <w:r>
+        <w:rPr>
+          <w:sz w:val="24"/>
+          <w:szCs w:val="24"/>
+        </w:rPr>
+        <w:t xml:space="preserve">, a </w:t>
       </w:r>
       <w:proofErr w:type="gramStart"/>
       <w:r>
@@ -2970,12 +3199,6 @@
         <w:gridCol w:w="2295"/>
       </w:tblGrid>
       <w:tr>
-        <w:tblPrEx>
-          <w:tblCellMar>
-            <w:top w:w="0" w:type="dxa"/>
-            <w:bottom w:w="0" w:type="dxa"/>
-          </w:tblCellMar>
-        </w:tblPrEx>
         <w:tc>
           <w:tcPr>
             <w:tcW w:w="0" w:type="auto"/>
@@ -3020,12 +3243,6 @@
         </w:tc>
       </w:tr>
       <w:tr>
-        <w:tblPrEx>
-          <w:tblCellMar>
-            <w:top w:w="0" w:type="dxa"/>
-            <w:bottom w:w="0" w:type="dxa"/>
-          </w:tblCellMar>
-        </w:tblPrEx>
         <w:tc>
           <w:tcPr>
             <w:tcW w:w="0" w:type="auto"/>
@@ -3065,12 +3282,6 @@
         </w:tc>
       </w:tr>
       <w:tr>
-        <w:tblPrEx>
-          <w:tblCellMar>
-            <w:top w:w="0" w:type="dxa"/>
-            <w:bottom w:w="0" w:type="dxa"/>
-          </w:tblCellMar>
-        </w:tblPrEx>
         <w:tc>
           <w:tcPr>
             <w:tcW w:w="0" w:type="auto"/>
@@ -3105,12 +3316,6 @@
         </w:tc>
       </w:tr>
       <w:tr>
-        <w:tblPrEx>
-          <w:tblCellMar>
-            <w:top w:w="0" w:type="dxa"/>
-            <w:bottom w:w="0" w:type="dxa"/>
-          </w:tblCellMar>
-        </w:tblPrEx>
         <w:tc>
           <w:tcPr>
             <w:tcW w:w="0" w:type="auto"/>
@@ -3145,12 +3350,6 @@
         </w:tc>
       </w:tr>
       <w:tr>
-        <w:tblPrEx>
-          <w:tblCellMar>
-            <w:top w:w="0" w:type="dxa"/>
-            <w:bottom w:w="0" w:type="dxa"/>
-          </w:tblCellMar>
-        </w:tblPrEx>
         <w:tc>
           <w:tcPr>
             <w:tcW w:w="0" w:type="auto"/>
@@ -3201,7 +3400,14 @@
           <w:sz w:val="24"/>
           <w:szCs w:val="24"/>
         </w:rPr>
-        <w:t>El análisis de tecnología muestra una penetración tecnológica de apenas el 17.45% para luminarias LED. Esto indica que la inmensa mayoría de la infraestructura actual en la UCE (82.55%) depende de la tecnología obsoleta y poco eficiente de vapor de sodio.</w:t>
+        <w:t xml:space="preserve">El </w:t>
+      </w:r>
+      <w:r>
+        <w:rPr>
+          <w:sz w:val="24"/>
+          <w:szCs w:val="24"/>
+        </w:rPr>
+        <w:t>análisis de tecnología muestra una penetración tecnológica de apenas el 17.45% para luminarias LED. Esto indica que la inmensa mayoría de la infraestructura actual en la UCE (82.55%) depende de la tecnología obsoleta y poco eficiente de vapor de sodio.</w:t>
       </w:r>
     </w:p>
     <w:p>
@@ -3210,20 +3416,30 @@
         <w:spacing w:before="300"/>
       </w:pPr>
       <w:r>
-        <w:t>7. ANÁLISIS GIS</w:t>
-      </w:r>
-    </w:p>
-    <w:p>
-      <w:pPr>
-        <w:spacing w:after="200"/>
-        <w:jc w:val="both"/>
-      </w:pPr>
-      <w:r>
-        <w:rPr>
-          <w:sz w:val="24"/>
-          <w:szCs w:val="24"/>
-        </w:rPr>
-        <w:t xml:space="preserve">La implementación de mapeo cartográfico posibilitó la identificación de patrones espaciales. El mapa de calor demuestra que la luminancia decae estrepitosamente en las zonas divisorias entre facultades. Los corredores principales mantienen una huella térmica lumínica, pero existen amplios 'agujeros negros' causados por la conjunción de lámparas dañadas de vapor de sodio, lo cual se constata </w:t>
+        <w:t xml:space="preserve">7. </w:t>
+      </w:r>
+      <w:r>
+        <w:t>ANÁLISIS GIS</w:t>
+      </w:r>
+    </w:p>
+    <w:p>
+      <w:pPr>
+        <w:spacing w:after="200"/>
+        <w:jc w:val="both"/>
+      </w:pPr>
+      <w:r>
+        <w:rPr>
+          <w:sz w:val="24"/>
+          <w:szCs w:val="24"/>
+        </w:rPr>
+        <w:t>La implementación de mapeo cartográfico posibilitó la identificación de patrones espaciales. El mapa de calor demuestra que la luminancia decae estrepitosamente en las zonas divisorias entre facultades. Los corredores principales mantienen una</w:t>
+      </w:r>
+      <w:r>
+        <w:rPr>
+          <w:sz w:val="24"/>
+          <w:szCs w:val="24"/>
+        </w:rPr>
+        <w:t xml:space="preserve"> huella térmica lumínica, pero existen amplios 'agujeros negros' causados por la conjunción de lámparas dañadas de vapor de sodio, lo cual se constata </w:t>
       </w:r>
       <w:proofErr w:type="spellStart"/>
       <w:r>
@@ -3261,7 +3477,14 @@
           <w:sz w:val="24"/>
           <w:szCs w:val="24"/>
         </w:rPr>
-        <w:t>Acorde a la Norma NTE INEN 069 y el CIE 115, las áreas de circulación peatonal o vías locales deben mantener un promedio mínimo de entre 15 y 20 luxes.</w:t>
+        <w:t>Acorde a la Norma NTE INEN 069 y el CIE 115, las áreas de circula</w:t>
+      </w:r>
+      <w:r>
+        <w:rPr>
+          <w:sz w:val="24"/>
+          <w:szCs w:val="24"/>
+        </w:rPr>
+        <w:t>ción peatonal o vías locales deben mantener un promedio mínimo de entre 15 y 20 luxes.</w:t>
       </w:r>
     </w:p>
     <w:tbl>
@@ -3287,12 +3510,6 @@
         <w:gridCol w:w="4867"/>
       </w:tblGrid>
       <w:tr>
-        <w:tblPrEx>
-          <w:tblCellMar>
-            <w:top w:w="0" w:type="dxa"/>
-            <w:bottom w:w="0" w:type="dxa"/>
-          </w:tblCellMar>
-        </w:tblPrEx>
         <w:tc>
           <w:tcPr>
             <w:tcW w:w="0" w:type="auto"/>
@@ -3358,12 +3575,6 @@
         </w:tc>
       </w:tr>
       <w:tr>
-        <w:tblPrEx>
-          <w:tblCellMar>
-            <w:top w:w="0" w:type="dxa"/>
-            <w:bottom w:w="0" w:type="dxa"/>
-          </w:tblCellMar>
-        </w:tblPrEx>
         <w:tc>
           <w:tcPr>
             <w:tcW w:w="0" w:type="auto"/>
@@ -3414,12 +3625,6 @@
         </w:tc>
       </w:tr>
       <w:tr>
-        <w:tblPrEx>
-          <w:tblCellMar>
-            <w:top w:w="0" w:type="dxa"/>
-            <w:bottom w:w="0" w:type="dxa"/>
-          </w:tblCellMar>
-        </w:tblPrEx>
         <w:tc>
           <w:tcPr>
             <w:tcW w:w="0" w:type="auto"/>
@@ -3470,25 +3675,22 @@
         </w:tc>
       </w:tr>
       <w:tr>
-        <w:tblPrEx>
-          <w:tblCellMar>
-            <w:top w:w="0" w:type="dxa"/>
-            <w:bottom w:w="0" w:type="dxa"/>
-          </w:tblCellMar>
-        </w:tblPrEx>
-        <w:tc>
-          <w:tcPr>
-            <w:tcW w:w="0" w:type="auto"/>
-            <w:tcMar>
-              <w:top w:w="100" w:type="dxa"/>
-              <w:left w:w="100" w:type="dxa"/>
-              <w:bottom w:w="100" w:type="dxa"/>
-              <w:right w:w="100" w:type="dxa"/>
-            </w:tcMar>
-          </w:tcPr>
-          <w:p>
-            <w:r>
-              <w:t>&gt; 20 lux</w:t>
+        <w:tc>
+          <w:tcPr>
+            <w:tcW w:w="0" w:type="auto"/>
+            <w:tcMar>
+              <w:top w:w="100" w:type="dxa"/>
+              <w:left w:w="100" w:type="dxa"/>
+              <w:bottom w:w="100" w:type="dxa"/>
+              <w:right w:w="100" w:type="dxa"/>
+            </w:tcMar>
+          </w:tcPr>
+          <w:p>
+            <w:r>
+              <w:t xml:space="preserve">&gt; 20 </w:t>
+            </w:r>
+            <w:r>
+              <w:t>lux</w:t>
             </w:r>
           </w:p>
         </w:tc>
@@ -3543,7 +3745,14 @@
           <w:szCs w:val="24"/>
         </w:rPr>
         <w:lastRenderedPageBreak/>
-        <w:t>Considerando que el promedio es de 55.33 lux, pero hay 52 luminarias apagadas o sin medición, la iluminación del campus presenta un INCUMPLIMIENTO generalizado de las normativas de seguridad, especialmente agravado por los bajos niveles de Reproducción Cromática del vapor de sodio.</w:t>
+        <w:t xml:space="preserve">Considerando que el promedio es de 55.33 lux, pero hay 52 luminarias apagadas o sin medición, la iluminación del campus presenta un INCUMPLIMIENTO generalizado de las normativas de seguridad, especialmente agravado por los </w:t>
+      </w:r>
+      <w:r>
+        <w:rPr>
+          <w:sz w:val="24"/>
+          <w:szCs w:val="24"/>
+        </w:rPr>
+        <w:t>bajos niveles de Reproducción Cromática del vapor de sodio.</w:t>
       </w:r>
     </w:p>
     <w:p>
@@ -3565,7 +3774,14 @@
           <w:sz w:val="24"/>
           <w:szCs w:val="24"/>
         </w:rPr>
-        <w:t>Para proyectar financieramente un programa de modernización, se ha realizado una investigación de precios de mercado (referencias internacionales y distribuidores oficiales):</w:t>
+        <w:t>Para proyectar financieramente un programa de modernización, se ha realizado una investigación de precios de mercado (referencias internacionales y distribuido</w:t>
+      </w:r>
+      <w:r>
+        <w:rPr>
+          <w:sz w:val="24"/>
+          <w:szCs w:val="24"/>
+        </w:rPr>
+        <w:t>res oficiales):</w:t>
       </w:r>
     </w:p>
     <w:tbl>
@@ -3592,12 +3808,6 @@
         <w:gridCol w:w="2035"/>
       </w:tblGrid>
       <w:tr>
-        <w:tblPrEx>
-          <w:tblCellMar>
-            <w:top w:w="0" w:type="dxa"/>
-            <w:bottom w:w="0" w:type="dxa"/>
-          </w:tblCellMar>
-        </w:tblPrEx>
         <w:tc>
           <w:tcPr>
             <w:tcW w:w="0" w:type="auto"/>
@@ -3684,12 +3894,6 @@
         </w:tc>
       </w:tr>
       <w:tr>
-        <w:tblPrEx>
-          <w:tblCellMar>
-            <w:top w:w="0" w:type="dxa"/>
-            <w:bottom w:w="0" w:type="dxa"/>
-          </w:tblCellMar>
-        </w:tblPrEx>
         <w:tc>
           <w:tcPr>
             <w:tcW w:w="0" w:type="auto"/>
@@ -3756,12 +3960,6 @@
         </w:tc>
       </w:tr>
       <w:tr>
-        <w:tblPrEx>
-          <w:tblCellMar>
-            <w:top w:w="0" w:type="dxa"/>
-            <w:bottom w:w="0" w:type="dxa"/>
-          </w:tblCellMar>
-        </w:tblPrEx>
         <w:tc>
           <w:tcPr>
             <w:tcW w:w="0" w:type="auto"/>
@@ -3828,12 +4026,6 @@
         </w:tc>
       </w:tr>
       <w:tr>
-        <w:tblPrEx>
-          <w:tblCellMar>
-            <w:top w:w="0" w:type="dxa"/>
-            <w:bottom w:w="0" w:type="dxa"/>
-          </w:tblCellMar>
-        </w:tblPrEx>
         <w:tc>
           <w:tcPr>
             <w:tcW w:w="0" w:type="auto"/>
@@ -3878,7 +4070,10 @@
           </w:tcPr>
           <w:p>
             <w:r>
-              <w:t>$ 40.00 - 80.00</w:t>
+              <w:t xml:space="preserve">$ 40.00 - </w:t>
+            </w:r>
+            <w:r>
+              <w:t>80.00</w:t>
             </w:r>
           </w:p>
         </w:tc>
@@ -3900,12 +4095,6 @@
         </w:tc>
       </w:tr>
       <w:tr>
-        <w:tblPrEx>
-          <w:tblCellMar>
-            <w:top w:w="0" w:type="dxa"/>
-            <w:bottom w:w="0" w:type="dxa"/>
-          </w:tblCellMar>
-        </w:tblPrEx>
         <w:tc>
           <w:tcPr>
             <w:tcW w:w="0" w:type="auto"/>
@@ -3988,7 +4177,14 @@
           <w:sz w:val="24"/>
           <w:szCs w:val="24"/>
         </w:rPr>
-        <w:t>Aunque el costo de capital (CAPEX) de una luminaria LED es hasta 2 o 3 veces el de un reemplazo de sodio (sólo bulbo y balasto), el OPEX derivado del consumo de kWh es lo que marca la verdadera diferencia a largo plazo.</w:t>
+        <w:t>Aunque el costo de capital (CAPEX) de una luminaria LED es hasta 2 o 3 veces el de un reemplazo de sodio (sólo bulbo y balasto), el OPEX derivado del consumo de kW</w:t>
+      </w:r>
+      <w:r>
+        <w:rPr>
+          <w:sz w:val="24"/>
+          <w:szCs w:val="24"/>
+        </w:rPr>
+        <w:t>h es lo que marca la verdadera diferencia a largo plazo.</w:t>
       </w:r>
     </w:p>
     <w:p>
@@ -4023,12 +4219,6 @@
         <w:gridCol w:w="3100"/>
       </w:tblGrid>
       <w:tr>
-        <w:tblPrEx>
-          <w:tblCellMar>
-            <w:top w:w="0" w:type="dxa"/>
-            <w:bottom w:w="0" w:type="dxa"/>
-          </w:tblCellMar>
-        </w:tblPrEx>
         <w:tc>
           <w:tcPr>
             <w:tcW w:w="0" w:type="auto"/>
@@ -4094,12 +4284,6 @@
         </w:tc>
       </w:tr>
       <w:tr>
-        <w:tblPrEx>
-          <w:tblCellMar>
-            <w:top w:w="0" w:type="dxa"/>
-            <w:bottom w:w="0" w:type="dxa"/>
-          </w:tblCellMar>
-        </w:tblPrEx>
         <w:tc>
           <w:tcPr>
             <w:tcW w:w="0" w:type="auto"/>
@@ -4150,12 +4334,6 @@
         </w:tc>
       </w:tr>
       <w:tr>
-        <w:tblPrEx>
-          <w:tblCellMar>
-            <w:top w:w="0" w:type="dxa"/>
-            <w:bottom w:w="0" w:type="dxa"/>
-          </w:tblCellMar>
-        </w:tblPrEx>
         <w:tc>
           <w:tcPr>
             <w:tcW w:w="0" w:type="auto"/>
@@ -4206,25 +4384,22 @@
         </w:tc>
       </w:tr>
       <w:tr>
-        <w:tblPrEx>
-          <w:tblCellMar>
-            <w:top w:w="0" w:type="dxa"/>
-            <w:bottom w:w="0" w:type="dxa"/>
-          </w:tblCellMar>
-        </w:tblPrEx>
-        <w:tc>
-          <w:tcPr>
-            <w:tcW w:w="0" w:type="auto"/>
-            <w:tcMar>
-              <w:top w:w="100" w:type="dxa"/>
-              <w:left w:w="100" w:type="dxa"/>
-              <w:bottom w:w="100" w:type="dxa"/>
-              <w:right w:w="100" w:type="dxa"/>
-            </w:tcMar>
-          </w:tcPr>
-          <w:p>
-            <w:r>
-              <w:t>Vida Útil</w:t>
+        <w:tc>
+          <w:tcPr>
+            <w:tcW w:w="0" w:type="auto"/>
+            <w:tcMar>
+              <w:top w:w="100" w:type="dxa"/>
+              <w:left w:w="100" w:type="dxa"/>
+              <w:bottom w:w="100" w:type="dxa"/>
+              <w:right w:w="100" w:type="dxa"/>
+            </w:tcMar>
+          </w:tcPr>
+          <w:p>
+            <w:r>
+              <w:t xml:space="preserve">Vida </w:t>
+            </w:r>
+            <w:r>
+              <w:t>Útil</w:t>
             </w:r>
           </w:p>
         </w:tc>
@@ -4272,12 +4447,6 @@
         </w:tc>
       </w:tr>
       <w:tr>
-        <w:tblPrEx>
-          <w:tblCellMar>
-            <w:top w:w="0" w:type="dxa"/>
-            <w:bottom w:w="0" w:type="dxa"/>
-          </w:tblCellMar>
-        </w:tblPrEx>
         <w:tc>
           <w:tcPr>
             <w:tcW w:w="0" w:type="auto"/>
@@ -4328,12 +4497,6 @@
         </w:tc>
       </w:tr>
       <w:tr>
-        <w:tblPrEx>
-          <w:tblCellMar>
-            <w:top w:w="0" w:type="dxa"/>
-            <w:bottom w:w="0" w:type="dxa"/>
-          </w:tblCellMar>
-        </w:tblPrEx>
         <w:tc>
           <w:tcPr>
             <w:tcW w:w="0" w:type="auto"/>
@@ -4384,12 +4547,6 @@
         </w:tc>
       </w:tr>
       <w:tr>
-        <w:tblPrEx>
-          <w:tblCellMar>
-            <w:top w:w="0" w:type="dxa"/>
-            <w:bottom w:w="0" w:type="dxa"/>
-          </w:tblCellMar>
-        </w:tblPrEx>
         <w:tc>
           <w:tcPr>
             <w:tcW w:w="0" w:type="auto"/>
@@ -4440,25 +4597,22 @@
         </w:tc>
       </w:tr>
       <w:tr>
-        <w:tblPrEx>
-          <w:tblCellMar>
-            <w:top w:w="0" w:type="dxa"/>
-            <w:bottom w:w="0" w:type="dxa"/>
-          </w:tblCellMar>
-        </w:tblPrEx>
-        <w:tc>
-          <w:tcPr>
-            <w:tcW w:w="0" w:type="auto"/>
-            <w:tcMar>
-              <w:top w:w="100" w:type="dxa"/>
-              <w:left w:w="100" w:type="dxa"/>
-              <w:bottom w:w="100" w:type="dxa"/>
-              <w:right w:w="100" w:type="dxa"/>
-            </w:tcMar>
-          </w:tcPr>
-          <w:p>
-            <w:r>
-              <w:t>Tiempo de Encendido</w:t>
+        <w:tc>
+          <w:tcPr>
+            <w:tcW w:w="0" w:type="auto"/>
+            <w:tcMar>
+              <w:top w:w="100" w:type="dxa"/>
+              <w:left w:w="100" w:type="dxa"/>
+              <w:bottom w:w="100" w:type="dxa"/>
+              <w:right w:w="100" w:type="dxa"/>
+            </w:tcMar>
+          </w:tcPr>
+          <w:p>
+            <w:r>
+              <w:t xml:space="preserve">Tiempo de </w:t>
+            </w:r>
+            <w:r>
+              <w:t>Encendido</w:t>
             </w:r>
           </w:p>
         </w:tc>
@@ -4496,12 +4650,6 @@
         </w:tc>
       </w:tr>
       <w:tr>
-        <w:tblPrEx>
-          <w:tblCellMar>
-            <w:top w:w="0" w:type="dxa"/>
-            <w:bottom w:w="0" w:type="dxa"/>
-          </w:tblCellMar>
-        </w:tblPrEx>
         <w:tc>
           <w:tcPr>
             <w:tcW w:w="0" w:type="auto"/>
@@ -4577,7 +4725,14 @@
           <w:sz w:val="24"/>
           <w:szCs w:val="24"/>
         </w:rPr>
-        <w:t>Considerando que se deben reemplazar 123 luminarias de vapor de sodio (y reparar luminarias dañadas), un cálculo simplificado arroja los siguientes escenarios:</w:t>
+        <w:t xml:space="preserve">Considerando que se deben reemplazar 123 luminarias de vapor de sodio (y reparar luminarias dañadas), un cálculo simplificado arroja los </w:t>
+      </w:r>
+      <w:r>
+        <w:rPr>
+          <w:sz w:val="24"/>
+          <w:szCs w:val="24"/>
+        </w:rPr>
+        <w:t>siguientes escenarios:</w:t>
       </w:r>
     </w:p>
     <w:p>
@@ -4604,7 +4759,14 @@
           <w:sz w:val="24"/>
           <w:szCs w:val="24"/>
         </w:rPr>
-        <w:t>• Ahorro de Potencia por punto: Alrededor de 100W de ahorro continuo. Trabajando 12 horas diarias, son 1.2 kWh al día de ahorro, equivalente a unos 438 kWh anuales por luminaria.</w:t>
+        <w:t xml:space="preserve">• Ahorro de Potencia por punto: Alrededor de 100W de ahorro continuo. Trabajando 12 horas diarias, son 1.2 kWh al día </w:t>
+      </w:r>
+      <w:r>
+        <w:rPr>
+          <w:sz w:val="24"/>
+          <w:szCs w:val="24"/>
+        </w:rPr>
+        <w:t>de ahorro, equivalente a unos 438 kWh anuales por luminaria.</w:t>
       </w:r>
     </w:p>
     <w:p>
@@ -4644,12 +4806,6 @@
         <w:gridCol w:w="4654"/>
       </w:tblGrid>
       <w:tr>
-        <w:tblPrEx>
-          <w:tblCellMar>
-            <w:top w:w="0" w:type="dxa"/>
-            <w:bottom w:w="0" w:type="dxa"/>
-          </w:tblCellMar>
-        </w:tblPrEx>
         <w:tc>
           <w:tcPr>
             <w:tcW w:w="0" w:type="auto"/>
@@ -4667,7 +4823,14 @@
                 <w:b/>
                 <w:bCs/>
               </w:rPr>
-              <w:t>Escenario</w:t>
+              <w:t>Escena</w:t>
+            </w:r>
+            <w:r>
+              <w:rPr>
+                <w:b/>
+                <w:bCs/>
+              </w:rPr>
+              <w:t>rio</w:t>
             </w:r>
           </w:p>
         </w:tc>
@@ -4745,12 +4908,6 @@
         </w:tc>
       </w:tr>
       <w:tr>
-        <w:tblPrEx>
-          <w:tblCellMar>
-            <w:top w:w="0" w:type="dxa"/>
-            <w:bottom w:w="0" w:type="dxa"/>
-          </w:tblCellMar>
-        </w:tblPrEx>
         <w:tc>
           <w:tcPr>
             <w:tcW w:w="0" w:type="auto"/>
@@ -4817,12 +4974,6 @@
         </w:tc>
       </w:tr>
       <w:tr>
-        <w:tblPrEx>
-          <w:tblCellMar>
-            <w:top w:w="0" w:type="dxa"/>
-            <w:bottom w:w="0" w:type="dxa"/>
-          </w:tblCellMar>
-        </w:tblPrEx>
         <w:tc>
           <w:tcPr>
             <w:tcW w:w="0" w:type="auto"/>
@@ -4889,12 +5040,6 @@
         </w:tc>
       </w:tr>
       <w:tr>
-        <w:tblPrEx>
-          <w:tblCellMar>
-            <w:top w:w="0" w:type="dxa"/>
-            <w:bottom w:w="0" w:type="dxa"/>
-          </w:tblCellMar>
-        </w:tblPrEx>
         <w:tc>
           <w:tcPr>
             <w:tcW w:w="0" w:type="auto"/>
@@ -4999,7 +5144,21 @@
           <w:sz w:val="24"/>
           <w:szCs w:val="24"/>
         </w:rPr>
-        <w:t>El cambio a LED no solo reduce drásticamente el consumo eléctrico y por ende la huella de carbono asociada al suministro de red interconectada, sino que elimina el riesgo del manejo de residuos tóxicos (vapores de mercurio) característicos del final de la vida útil de lámparas de alta presión. Además, las ópticas LED disminuyen el escape de luz hacia el cielo, controlando la contaminación lumínica.</w:t>
+        <w:t>El cambio a LED no solo reduce drásticamente el consumo eléctrico y por ende la huella de carbono as</w:t>
+      </w:r>
+      <w:r>
+        <w:rPr>
+          <w:sz w:val="24"/>
+          <w:szCs w:val="24"/>
+        </w:rPr>
+        <w:t xml:space="preserve">ociada al suministro de red interconectada, sino que elimina el riesgo del manejo de residuos tóxicos (vapores de mercurio) característicos del final de la vida útil de lámparas de alta presión. Además, las ópticas LED disminuyen el escape de luz hacia el </w:t>
+      </w:r>
+      <w:r>
+        <w:rPr>
+          <w:sz w:val="24"/>
+          <w:szCs w:val="24"/>
+        </w:rPr>
+        <w:t>cielo, controlando la contaminación lumínica.</w:t>
       </w:r>
     </w:p>
     <w:p>
@@ -5021,7 +5180,14 @@
           <w:sz w:val="24"/>
           <w:szCs w:val="24"/>
         </w:rPr>
-        <w:t>Los datos recopilados (altas tasas de fallos, tecnología predominante de sodio, valores lumínicos inconsistentes) reflejan una infraestructura en la fase de obsolescencia física y tecnológica. Mantener estos sistemas resulta en un gasto innecesario de fondos públicos y compromete el bienestar de los estudiantes. Los resultados coinciden plenamente con la literatura contemporánea sobre gestión de iluminación de recintos universitarios.</w:t>
+        <w:t>Los datos recopilados (altas tasas de fallos, tecnología predominante de sodio, valores lumínicos inconsistentes) reflejan una infraestructura en la fase de obsolescencia física y tecnológica. Man</w:t>
+      </w:r>
+      <w:r>
+        <w:rPr>
+          <w:sz w:val="24"/>
+          <w:szCs w:val="24"/>
+        </w:rPr>
+        <w:t>tener estos sistemas resulta en un gasto innecesario de fondos públicos y compromete el bienestar de los estudiantes. Los resultados coinciden plenamente con la literatura contemporánea sobre gestión de iluminación de recintos universitarios.</w:t>
       </w:r>
     </w:p>
     <w:p>
@@ -5030,7 +5196,10 @@
         <w:spacing w:before="300"/>
       </w:pPr>
       <w:r>
-        <w:t>14. CONCLUSIONES GENERALES</w:t>
+        <w:t>14. CONCLUSIO</w:t>
+      </w:r>
+      <w:r>
+        <w:t>NES GENERALES</w:t>
       </w:r>
     </w:p>
     <w:p>
@@ -5056,7 +5225,14 @@
           <w:sz w:val="24"/>
           <w:szCs w:val="24"/>
         </w:rPr>
-        <w:t>• ¿Existen riesgos? Sí. Desde el riesgo derivado de la inseguridad por la oscuridad, hasta el riesgo eléctrico por cableado en mal estado.</w:t>
+        <w:t xml:space="preserve">• ¿Existen riesgos? Sí. Desde el riesgo derivado de la inseguridad por la oscuridad, hasta el riesgo </w:t>
+      </w:r>
+      <w:r>
+        <w:rPr>
+          <w:sz w:val="24"/>
+          <w:szCs w:val="24"/>
+        </w:rPr>
+        <w:t>eléctrico por cableado en mal estado.</w:t>
       </w:r>
     </w:p>
     <w:p>
@@ -5083,7 +5259,14 @@
           <w:szCs w:val="24"/>
         </w:rPr>
         <w:lastRenderedPageBreak/>
-        <w:t xml:space="preserve">• ¿La metodología utilizada fue adecuada? El levantamiento georreferenciado con </w:t>
+        <w:t>• ¿La metodología utilizada fue adecuada? El levantamiento g</w:t>
+      </w:r>
+      <w:r>
+        <w:rPr>
+          <w:sz w:val="24"/>
+          <w:szCs w:val="24"/>
+        </w:rPr>
+        <w:t xml:space="preserve">eorreferenciado con </w:t>
       </w:r>
       <w:proofErr w:type="spellStart"/>
       <w:r>
@@ -5125,7 +5308,14 @@
           <w:sz w:val="24"/>
           <w:szCs w:val="24"/>
         </w:rPr>
-        <w:t>• ¿Es viable mantener sodio? No. Es inviable económica y ambientalmente a mediano plazo.</w:t>
+        <w:t xml:space="preserve">• ¿Es viable mantener sodio? No. Es inviable económica y </w:t>
+      </w:r>
+      <w:r>
+        <w:rPr>
+          <w:sz w:val="24"/>
+          <w:szCs w:val="24"/>
+        </w:rPr>
+        <w:t>ambientalmente a mediano plazo.</w:t>
       </w:r>
     </w:p>
     <w:p>
@@ -5151,7 +5341,14 @@
           <w:sz w:val="24"/>
           <w:szCs w:val="24"/>
         </w:rPr>
-        <w:t>• ¿La migración tendría beneficios reales? Generaría ahorros superiores al 50% en consumo energético, reduciría el mantenimiento, y mejoraría exponencialmente la seguridad del campus.</w:t>
+        <w:t xml:space="preserve">• ¿La migración tendría beneficios reales? Generaría ahorros superiores al 50% en consumo energético, reduciría el mantenimiento, y </w:t>
+      </w:r>
+      <w:r>
+        <w:rPr>
+          <w:sz w:val="24"/>
+          <w:szCs w:val="24"/>
+        </w:rPr>
+        <w:t>mejoraría exponencialmente la seguridad del campus.</w:t>
       </w:r>
     </w:p>
     <w:p>
@@ -5186,7 +5383,14 @@
           <w:sz w:val="24"/>
           <w:szCs w:val="24"/>
         </w:rPr>
-        <w:t>2. Corto Plazo: Iniciar licitación para reemplazar todas las cabezas de vapor de sodio por luminarias LED de 60W a 100W.</w:t>
+        <w:t>2. Corto Plazo: Iniciar licitación para reemplazar to</w:t>
+      </w:r>
+      <w:r>
+        <w:rPr>
+          <w:sz w:val="24"/>
+          <w:szCs w:val="24"/>
+        </w:rPr>
+        <w:t>das las cabezas de vapor de sodio por luminarias LED de 60W a 100W.</w:t>
       </w:r>
     </w:p>
     <w:p>
@@ -5244,7 +5448,14 @@
           <w:sz w:val="24"/>
           <w:szCs w:val="24"/>
         </w:rPr>
-        <w:t xml:space="preserve"> inteligente (Smart Campus) para atenuación horaria programada.</w:t>
+        <w:t xml:space="preserve"> inteligente (Smart </w:t>
+      </w:r>
+      <w:r>
+        <w:rPr>
+          <w:sz w:val="24"/>
+          <w:szCs w:val="24"/>
+        </w:rPr>
+        <w:t>Campus) para atenuación horaria programada.</w:t>
       </w:r>
     </w:p>
     <w:p>
@@ -5288,20 +5499,34 @@
           <w:sz w:val="24"/>
           <w:szCs w:val="24"/>
         </w:rPr>
-        <w:t>[1] INEN, 'NTE INEN 069: Niveles de Iluminación para espacios peatonales y vías', Instituto Ecuatoriano de Normalización, Quito, Ecuador.</w:t>
-      </w:r>
-    </w:p>
-    <w:p>
-      <w:pPr>
-        <w:spacing w:after="200"/>
-        <w:jc w:val="both"/>
-      </w:pPr>
-      <w:r>
-        <w:rPr>
-          <w:sz w:val="24"/>
-          <w:szCs w:val="24"/>
-        </w:rPr>
-        <w:t>[2] ARCONEL, 'Regulación No. ARCONEL 005/18 - Prestación del Servicio de Alumbrado Público General', Agencia de Regulación y Control de Electricidad, 2018.</w:t>
+        <w:t xml:space="preserve">[1] INEN, 'NTE INEN 069: Niveles </w:t>
+      </w:r>
+      <w:r>
+        <w:rPr>
+          <w:sz w:val="24"/>
+          <w:szCs w:val="24"/>
+        </w:rPr>
+        <w:t>de Iluminación para espacios peatonales y vías', Instituto Ecuatoriano de Normalización, Quito, Ecuador.</w:t>
+      </w:r>
+    </w:p>
+    <w:p>
+      <w:pPr>
+        <w:spacing w:after="200"/>
+        <w:jc w:val="both"/>
+      </w:pPr>
+      <w:r>
+        <w:rPr>
+          <w:sz w:val="24"/>
+          <w:szCs w:val="24"/>
+        </w:rPr>
+        <w:t>[2] ARCONEL, 'Regulación No. ARCONEL 005/18 - Prestación del Servicio de Alumbrado Público General', Agencia de Regulación y Control de Electricidad, 2</w:t>
+      </w:r>
+      <w:r>
+        <w:rPr>
+          <w:sz w:val="24"/>
+          <w:szCs w:val="24"/>
+        </w:rPr>
+        <w:t>018.</w:t>
       </w:r>
     </w:p>
     <w:p>
@@ -5352,7 +5577,15 @@
           <w:szCs w:val="24"/>
           <w:lang w:val="en-US"/>
         </w:rPr>
-        <w:t>[5] DOE, 'Solid-State Lighting R&amp;D Plan', U.S. Department of Energy, 2021.</w:t>
+        <w:t>[5] DOE</w:t>
+      </w:r>
+      <w:r>
+        <w:rPr>
+          <w:sz w:val="24"/>
+          <w:szCs w:val="24"/>
+          <w:lang w:val="en-US"/>
+        </w:rPr>
+        <w:t>, 'Solid-State Lighting R&amp;D Plan', U.S. Department of Energy, 2021.</w:t>
       </w:r>
     </w:p>
     <w:sectPr>
@@ -5368,7 +5601,7 @@
 </file>
 
 <file path=word/endnotes.xml><?xml version="1.0" encoding="utf-8"?>
-<w:endnotes xmlns:wpc="http://schemas.microsoft.com/office/word/2010/wordprocessingCanvas" xmlns:cx="http://schemas.microsoft.com/office/drawing/2014/chartex" xmlns:cx1="http://schemas.microsoft.com/office/drawing/2015/9/8/chartex" xmlns:cx2="http://schemas.microsoft.com/office/drawing/2015/10/21/chartex" xmlns:cx3="http://schemas.microsoft.com/office/drawing/2016/5/9/chartex" xmlns:cx4="http://schemas.microsoft.com/office/drawing/2016/5/10/chartex" xmlns:cx5="http://schemas.microsoft.com/office/drawing/2016/5/11/chartex" xmlns:cx6="http://schemas.microsoft.com/office/drawing/2016/5/12/chartex" xmlns:cx7="http://schemas.microsoft.com/office/drawing/2016/5/13/chartex" xmlns:cx8="http://schemas.microsoft.com/office/drawing/2016/5/14/chartex" xmlns:mc="http://schemas.openxmlformats.org/markup-compatibility/2006" xmlns:aink="http://schemas.microsoft.com/office/drawing/2016/ink" xmlns:am3d="http://schemas.microsoft.com/office/drawing/2017/model3d" xmlns:o="urn:schemas-microsoft-com:office:office" xmlns:oel="http://schemas.microsoft.com/office/2019/extlst" xmlns:r="http://schemas.openxmlformats.org/officeDocument/2006/relationships" xmlns:m="http://schemas.openxmlformats.org/officeDocument/2006/math" xmlns:v="urn:schemas-microsoft-com:vml" xmlns:wp14="http://schemas.microsoft.com/office/word/2010/wordprocessingDrawing" xmlns:wp="http://schemas.openxmlformats.org/drawingml/2006/wordprocessingDrawing" xmlns:w10="urn:schemas-microsoft-com:office:word" xmlns:w="http://schemas.openxmlformats.org/wordprocessingml/2006/main" xmlns:w14="http://schemas.microsoft.com/office/word/2010/wordml" xmlns:w15="http://schemas.microsoft.com/office/word/2012/wordml" xmlns:w16cex="http://schemas.microsoft.com/office/word/2018/wordml/cex" xmlns:w16cid="http://schemas.microsoft.com/office/word/2016/wordml/cid" xmlns:w16="http://schemas.microsoft.com/office/word/2018/wordml" xmlns:w16du="http://schemas.microsoft.com/office/word/2023/wordml/word16du" xmlns:w16sdtdh="http://schemas.microsoft.com/office/word/2020/wordml/sdtdatahash" xmlns:w16sdtfl="http://schemas.microsoft.com/office/word/2024/wordml/sdtformatlock" xmlns:w16se="http://schemas.microsoft.com/office/word/2015/wordml/symex" xmlns:wpg="http://schemas.microsoft.com/office/word/2010/wordprocessingGroup" xmlns:wpi="http://schemas.microsoft.com/office/word/2010/wordprocessingInk" xmlns:wne="http://schemas.microsoft.com/office/word/2006/wordml" xmlns:wps="http://schemas.microsoft.com/office/word/2010/wordprocessingShape" mc:Ignorable="w14 w15 w16se w16cid w16 w16cex w16sdtdh w16sdtfl w16du wp14">
+<w:endnotes xmlns:wpc="http://schemas.microsoft.com/office/word/2010/wordprocessingCanvas" xmlns:cx="http://schemas.microsoft.com/office/drawing/2014/chartex" xmlns:cx1="http://schemas.microsoft.com/office/drawing/2015/9/8/chartex" xmlns:cx2="http://schemas.microsoft.com/office/drawing/2015/10/21/chartex" xmlns:cx3="http://schemas.microsoft.com/office/drawing/2016/5/9/chartex" xmlns:cx4="http://schemas.microsoft.com/office/drawing/2016/5/10/chartex" xmlns:cx5="http://schemas.microsoft.com/office/drawing/2016/5/11/chartex" xmlns:cx6="http://schemas.microsoft.com/office/drawing/2016/5/12/chartex" xmlns:cx7="http://schemas.microsoft.com/office/drawing/2016/5/13/chartex" xmlns:cx8="http://schemas.microsoft.com/office/drawing/2016/5/14/chartex" xmlns:mc="http://schemas.openxmlformats.org/markup-compatibility/2006" xmlns:aink="http://schemas.microsoft.com/office/drawing/2016/ink" xmlns:am3d="http://schemas.microsoft.com/office/drawing/2017/model3d" xmlns:o="urn:schemas-microsoft-com:office:office" xmlns:r="http://schemas.openxmlformats.org/officeDocument/2006/relationships" xmlns:m="http://schemas.openxmlformats.org/officeDocument/2006/math" xmlns:v="urn:schemas-microsoft-com:vml" xmlns:wp14="http://schemas.microsoft.com/office/word/2010/wordprocessingDrawing" xmlns:wp="http://schemas.openxmlformats.org/drawingml/2006/wordprocessingDrawing" xmlns:w10="urn:schemas-microsoft-com:office:word" xmlns:w="http://schemas.openxmlformats.org/wordprocessingml/2006/main" xmlns:w14="http://schemas.microsoft.com/office/word/2010/wordml" xmlns:w15="http://schemas.microsoft.com/office/word/2012/wordml" xmlns:w16cex="http://schemas.microsoft.com/office/word/2018/wordml/cex" xmlns:w16cid="http://schemas.microsoft.com/office/word/2016/wordml/cid" xmlns:w16="http://schemas.microsoft.com/office/word/2018/wordml" xmlns:w16sdtdh="http://schemas.microsoft.com/office/word/2020/wordml/sdtdatahash" xmlns:w16se="http://schemas.microsoft.com/office/word/2015/wordml/symex" xmlns:wpg="http://schemas.microsoft.com/office/word/2010/wordprocessingGroup" xmlns:wpi="http://schemas.microsoft.com/office/word/2010/wordprocessingInk" xmlns:wne="http://schemas.microsoft.com/office/word/2006/wordml" xmlns:wps="http://schemas.microsoft.com/office/word/2010/wordprocessingShape" mc:Ignorable="w14 w15 w16se w16cid w16 w16cex w16sdtdh wp14">
   <w:endnote w:type="separator" w:id="-1">
     <w:p>
       <w:r>
@@ -5387,7 +5620,7 @@
 </file>
 
 <file path=word/footer1.xml><?xml version="1.0" encoding="utf-8"?>
-<w:ftr xmlns:wpc="http://schemas.microsoft.com/office/word/2010/wordprocessingCanvas" xmlns:cx="http://schemas.microsoft.com/office/drawing/2014/chartex" xmlns:cx1="http://schemas.microsoft.com/office/drawing/2015/9/8/chartex" xmlns:cx2="http://schemas.microsoft.com/office/drawing/2015/10/21/chartex" xmlns:cx3="http://schemas.microsoft.com/office/drawing/2016/5/9/chartex" xmlns:cx4="http://schemas.microsoft.com/office/drawing/2016/5/10/chartex" xmlns:cx5="http://schemas.microsoft.com/office/drawing/2016/5/11/chartex" xmlns:cx6="http://schemas.microsoft.com/office/drawing/2016/5/12/chartex" xmlns:cx7="http://schemas.microsoft.com/office/drawing/2016/5/13/chartex" xmlns:cx8="http://schemas.microsoft.com/office/drawing/2016/5/14/chartex" xmlns:mc="http://schemas.openxmlformats.org/markup-compatibility/2006" xmlns:aink="http://schemas.microsoft.com/office/drawing/2016/ink" xmlns:am3d="http://schemas.microsoft.com/office/drawing/2017/model3d" xmlns:o="urn:schemas-microsoft-com:office:office" xmlns:oel="http://schemas.microsoft.com/office/2019/extlst" xmlns:r="http://schemas.openxmlformats.org/officeDocument/2006/relationships" xmlns:m="http://schemas.openxmlformats.org/officeDocument/2006/math" xmlns:v="urn:schemas-microsoft-com:vml" xmlns:wp14="http://schemas.microsoft.com/office/word/2010/wordprocessingDrawing" xmlns:wp="http://schemas.openxmlformats.org/drawingml/2006/wordprocessingDrawing" xmlns:w10="urn:schemas-microsoft-com:office:word" xmlns:w="http://schemas.openxmlformats.org/wordprocessingml/2006/main" xmlns:w14="http://schemas.microsoft.com/office/word/2010/wordml" xmlns:w15="http://schemas.microsoft.com/office/word/2012/wordml" xmlns:w16cex="http://schemas.microsoft.com/office/word/2018/wordml/cex" xmlns:w16cid="http://schemas.microsoft.com/office/word/2016/wordml/cid" xmlns:w16="http://schemas.microsoft.com/office/word/2018/wordml" xmlns:w16du="http://schemas.microsoft.com/office/word/2023/wordml/word16du" xmlns:w16sdtdh="http://schemas.microsoft.com/office/word/2020/wordml/sdtdatahash" xmlns:w16sdtfl="http://schemas.microsoft.com/office/word/2024/wordml/sdtformatlock" xmlns:w16se="http://schemas.microsoft.com/office/word/2015/wordml/symex" xmlns:wpg="http://schemas.microsoft.com/office/word/2010/wordprocessingGroup" xmlns:wpi="http://schemas.microsoft.com/office/word/2010/wordprocessingInk" xmlns:wne="http://schemas.microsoft.com/office/word/2006/wordml" xmlns:wps="http://schemas.microsoft.com/office/word/2010/wordprocessingShape" mc:Ignorable="w14 w15 w16se w16cid w16 w16cex w16sdtdh w16sdtfl w16du wp14">
+<w:ftr xmlns:wpc="http://schemas.microsoft.com/office/word/2010/wordprocessingCanvas" xmlns:cx="http://schemas.microsoft.com/office/drawing/2014/chartex" xmlns:cx1="http://schemas.microsoft.com/office/drawing/2015/9/8/chartex" xmlns:cx2="http://schemas.microsoft.com/office/drawing/2015/10/21/chartex" xmlns:cx3="http://schemas.microsoft.com/office/drawing/2016/5/9/chartex" xmlns:cx4="http://schemas.microsoft.com/office/drawing/2016/5/10/chartex" xmlns:cx5="http://schemas.microsoft.com/office/drawing/2016/5/11/chartex" xmlns:cx6="http://schemas.microsoft.com/office/drawing/2016/5/12/chartex" xmlns:cx7="http://schemas.microsoft.com/office/drawing/2016/5/13/chartex" xmlns:cx8="http://schemas.microsoft.com/office/drawing/2016/5/14/chartex" xmlns:mc="http://schemas.openxmlformats.org/markup-compatibility/2006" xmlns:aink="http://schemas.microsoft.com/office/drawing/2016/ink" xmlns:am3d="http://schemas.microsoft.com/office/drawing/2017/model3d" xmlns:o="urn:schemas-microsoft-com:office:office" xmlns:r="http://schemas.openxmlformats.org/officeDocument/2006/relationships" xmlns:m="http://schemas.openxmlformats.org/officeDocument/2006/math" xmlns:v="urn:schemas-microsoft-com:vml" xmlns:wp14="http://schemas.microsoft.com/office/word/2010/wordprocessingDrawing" xmlns:wp="http://schemas.openxmlformats.org/drawingml/2006/wordprocessingDrawing" xmlns:w10="urn:schemas-microsoft-com:office:word" xmlns:w="http://schemas.openxmlformats.org/wordprocessingml/2006/main" xmlns:w14="http://schemas.microsoft.com/office/word/2010/wordml" xmlns:w15="http://schemas.microsoft.com/office/word/2012/wordml" xmlns:w16cex="http://schemas.microsoft.com/office/word/2018/wordml/cex" xmlns:w16cid="http://schemas.microsoft.com/office/word/2016/wordml/cid" xmlns:w16="http://schemas.microsoft.com/office/word/2018/wordml" xmlns:w16sdtdh="http://schemas.microsoft.com/office/word/2020/wordml/sdtdatahash" xmlns:w16se="http://schemas.microsoft.com/office/word/2015/wordml/symex" xmlns:wpg="http://schemas.microsoft.com/office/word/2010/wordprocessingGroup" xmlns:wpi="http://schemas.microsoft.com/office/word/2010/wordprocessingInk" xmlns:wne="http://schemas.microsoft.com/office/word/2006/wordml" xmlns:wps="http://schemas.microsoft.com/office/word/2010/wordprocessingShape" mc:Ignorable="w14 w15 w16se w16cid w16 w16cex w16sdtdh wp14">
   <w:p>
     <w:pPr>
       <w:jc w:val="center"/>
@@ -5415,7 +5648,7 @@
 </file>
 
 <file path=word/footnotes.xml><?xml version="1.0" encoding="utf-8"?>
-<w:footnotes xmlns:wpc="http://schemas.microsoft.com/office/word/2010/wordprocessingCanvas" xmlns:cx="http://schemas.microsoft.com/office/drawing/2014/chartex" xmlns:cx1="http://schemas.microsoft.com/office/drawing/2015/9/8/chartex" xmlns:cx2="http://schemas.microsoft.com/office/drawing/2015/10/21/chartex" xmlns:cx3="http://schemas.microsoft.com/office/drawing/2016/5/9/chartex" xmlns:cx4="http://schemas.microsoft.com/office/drawing/2016/5/10/chartex" xmlns:cx5="http://schemas.microsoft.com/office/drawing/2016/5/11/chartex" xmlns:cx6="http://schemas.microsoft.com/office/drawing/2016/5/12/chartex" xmlns:cx7="http://schemas.microsoft.com/office/drawing/2016/5/13/chartex" xmlns:cx8="http://schemas.microsoft.com/office/drawing/2016/5/14/chartex" xmlns:mc="http://schemas.openxmlformats.org/markup-compatibility/2006" xmlns:aink="http://schemas.microsoft.com/office/drawing/2016/ink" xmlns:am3d="http://schemas.microsoft.com/office/drawing/2017/model3d" xmlns:o="urn:schemas-microsoft-com:office:office" xmlns:oel="http://schemas.microsoft.com/office/2019/extlst" xmlns:r="http://schemas.openxmlformats.org/officeDocument/2006/relationships" xmlns:m="http://schemas.openxmlformats.org/officeDocument/2006/math" xmlns:v="urn:schemas-microsoft-com:vml" xmlns:wp14="http://schemas.microsoft.com/office/word/2010/wordprocessingDrawing" xmlns:wp="http://schemas.openxmlformats.org/drawingml/2006/wordprocessingDrawing" xmlns:w10="urn:schemas-microsoft-com:office:word" xmlns:w="http://schemas.openxmlformats.org/wordprocessingml/2006/main" xmlns:w14="http://schemas.microsoft.com/office/word/2010/wordml" xmlns:w15="http://schemas.microsoft.com/office/word/2012/wordml" xmlns:w16cex="http://schemas.microsoft.com/office/word/2018/wordml/cex" xmlns:w16cid="http://schemas.microsoft.com/office/word/2016/wordml/cid" xmlns:w16="http://schemas.microsoft.com/office/word/2018/wordml" xmlns:w16du="http://schemas.microsoft.com/office/word/2023/wordml/word16du" xmlns:w16sdtdh="http://schemas.microsoft.com/office/word/2020/wordml/sdtdatahash" xmlns:w16sdtfl="http://schemas.microsoft.com/office/word/2024/wordml/sdtformatlock" xmlns:w16se="http://schemas.microsoft.com/office/word/2015/wordml/symex" xmlns:wpg="http://schemas.microsoft.com/office/word/2010/wordprocessingGroup" xmlns:wpi="http://schemas.microsoft.com/office/word/2010/wordprocessingInk" xmlns:wne="http://schemas.microsoft.com/office/word/2006/wordml" xmlns:wps="http://schemas.microsoft.com/office/word/2010/wordprocessingShape" mc:Ignorable="w14 w15 w16se w16cid w16 w16cex w16sdtdh w16sdtfl w16du wp14">
+<w:footnotes xmlns:wpc="http://schemas.microsoft.com/office/word/2010/wordprocessingCanvas" xmlns:cx="http://schemas.microsoft.com/office/drawing/2014/chartex" xmlns:cx1="http://schemas.microsoft.com/office/drawing/2015/9/8/chartex" xmlns:cx2="http://schemas.microsoft.com/office/drawing/2015/10/21/chartex" xmlns:cx3="http://schemas.microsoft.com/office/drawing/2016/5/9/chartex" xmlns:cx4="http://schemas.microsoft.com/office/drawing/2016/5/10/chartex" xmlns:cx5="http://schemas.microsoft.com/office/drawing/2016/5/11/chartex" xmlns:cx6="http://schemas.microsoft.com/office/drawing/2016/5/12/chartex" xmlns:cx7="http://schemas.microsoft.com/office/drawing/2016/5/13/chartex" xmlns:cx8="http://schemas.microsoft.com/office/drawing/2016/5/14/chartex" xmlns:mc="http://schemas.openxmlformats.org/markup-compatibility/2006" xmlns:aink="http://schemas.microsoft.com/office/drawing/2016/ink" xmlns:am3d="http://schemas.microsoft.com/office/drawing/2017/model3d" xmlns:o="urn:schemas-microsoft-com:office:office" xmlns:r="http://schemas.openxmlformats.org/officeDocument/2006/relationships" xmlns:m="http://schemas.openxmlformats.org/officeDocument/2006/math" xmlns:v="urn:schemas-microsoft-com:vml" xmlns:wp14="http://schemas.microsoft.com/office/word/2010/wordprocessingDrawing" xmlns:wp="http://schemas.openxmlformats.org/drawingml/2006/wordprocessingDrawing" xmlns:w10="urn:schemas-microsoft-com:office:word" xmlns:w="http://schemas.openxmlformats.org/wordprocessingml/2006/main" xmlns:w14="http://schemas.microsoft.com/office/word/2010/wordml" xmlns:w15="http://schemas.microsoft.com/office/word/2012/wordml" xmlns:w16cex="http://schemas.microsoft.com/office/word/2018/wordml/cex" xmlns:w16cid="http://schemas.microsoft.com/office/word/2016/wordml/cid" xmlns:w16="http://schemas.microsoft.com/office/word/2018/wordml" xmlns:w16sdtdh="http://schemas.microsoft.com/office/word/2020/wordml/sdtdatahash" xmlns:w16se="http://schemas.microsoft.com/office/word/2015/wordml/symex" xmlns:wpg="http://schemas.microsoft.com/office/word/2010/wordprocessingGroup" xmlns:wpi="http://schemas.microsoft.com/office/word/2010/wordprocessingInk" xmlns:wne="http://schemas.microsoft.com/office/word/2006/wordml" xmlns:wps="http://schemas.microsoft.com/office/word/2010/wordprocessingShape" mc:Ignorable="w14 w15 w16se w16cid w16 w16cex w16sdtdh wp14">
   <w:footnote w:type="separator" w:id="-1">
     <w:p>
       <w:r>
@@ -5434,7 +5667,7 @@
 </file>
 
 <file path=word/numbering.xml><?xml version="1.0" encoding="utf-8"?>
-<w:numbering xmlns:wpc="http://schemas.microsoft.com/office/word/2010/wordprocessingCanvas" xmlns:cx="http://schemas.microsoft.com/office/drawing/2014/chartex" xmlns:cx1="http://schemas.microsoft.com/office/drawing/2015/9/8/chartex" xmlns:cx2="http://schemas.microsoft.com/office/drawing/2015/10/21/chartex" xmlns:cx3="http://schemas.microsoft.com/office/drawing/2016/5/9/chartex" xmlns:cx4="http://schemas.microsoft.com/office/drawing/2016/5/10/chartex" xmlns:cx5="http://schemas.microsoft.com/office/drawing/2016/5/11/chartex" xmlns:cx6="http://schemas.microsoft.com/office/drawing/2016/5/12/chartex" xmlns:cx7="http://schemas.microsoft.com/office/drawing/2016/5/13/chartex" xmlns:cx8="http://schemas.microsoft.com/office/drawing/2016/5/14/chartex" xmlns:mc="http://schemas.openxmlformats.org/markup-compatibility/2006" xmlns:aink="http://schemas.microsoft.com/office/drawing/2016/ink" xmlns:am3d="http://schemas.microsoft.com/office/drawing/2017/model3d" xmlns:o="urn:schemas-microsoft-com:office:office" xmlns:oel="http://schemas.microsoft.com/office/2019/extlst" xmlns:r="http://schemas.openxmlformats.org/officeDocument/2006/relationships" xmlns:m="http://schemas.openxmlformats.org/officeDocument/2006/math" xmlns:v="urn:schemas-microsoft-com:vml" xmlns:wp14="http://schemas.microsoft.com/office/word/2010/wordprocessingDrawing" xmlns:wp="http://schemas.openxmlformats.org/drawingml/2006/wordprocessingDrawing" xmlns:w10="urn:schemas-microsoft-com:office:word" xmlns:w="http://schemas.openxmlformats.org/wordprocessingml/2006/main" xmlns:w14="http://schemas.microsoft.com/office/word/2010/wordml" xmlns:w15="http://schemas.microsoft.com/office/word/2012/wordml" xmlns:w16cex="http://schemas.microsoft.com/office/word/2018/wordml/cex" xmlns:w16cid="http://schemas.microsoft.com/office/word/2016/wordml/cid" xmlns:w16="http://schemas.microsoft.com/office/word/2018/wordml" xmlns:w16du="http://schemas.microsoft.com/office/word/2023/wordml/word16du" xmlns:w16sdtdh="http://schemas.microsoft.com/office/word/2020/wordml/sdtdatahash" xmlns:w16sdtfl="http://schemas.microsoft.com/office/word/2024/wordml/sdtformatlock" xmlns:w16se="http://schemas.microsoft.com/office/word/2015/wordml/symex" xmlns:wpg="http://schemas.microsoft.com/office/word/2010/wordprocessingGroup" xmlns:wpi="http://schemas.microsoft.com/office/word/2010/wordprocessingInk" xmlns:wne="http://schemas.microsoft.com/office/word/2006/wordml" xmlns:wps="http://schemas.microsoft.com/office/word/2010/wordprocessingShape" mc:Ignorable="w14 w15 w16se w16cid w16 w16cex w16sdtdh w16sdtfl w16du wp14">
+<w:numbering xmlns:wpc="http://schemas.microsoft.com/office/word/2010/wordprocessingCanvas" xmlns:cx="http://schemas.microsoft.com/office/drawing/2014/chartex" xmlns:cx1="http://schemas.microsoft.com/office/drawing/2015/9/8/chartex" xmlns:cx2="http://schemas.microsoft.com/office/drawing/2015/10/21/chartex" xmlns:cx3="http://schemas.microsoft.com/office/drawing/2016/5/9/chartex" xmlns:cx4="http://schemas.microsoft.com/office/drawing/2016/5/10/chartex" xmlns:cx5="http://schemas.microsoft.com/office/drawing/2016/5/11/chartex" xmlns:cx6="http://schemas.microsoft.com/office/drawing/2016/5/12/chartex" xmlns:cx7="http://schemas.microsoft.com/office/drawing/2016/5/13/chartex" xmlns:cx8="http://schemas.microsoft.com/office/drawing/2016/5/14/chartex" xmlns:mc="http://schemas.openxmlformats.org/markup-compatibility/2006" xmlns:aink="http://schemas.microsoft.com/office/drawing/2016/ink" xmlns:am3d="http://schemas.microsoft.com/office/drawing/2017/model3d" xmlns:o="urn:schemas-microsoft-com:office:office" xmlns:r="http://schemas.openxmlformats.org/officeDocument/2006/relationships" xmlns:m="http://schemas.openxmlformats.org/officeDocument/2006/math" xmlns:v="urn:schemas-microsoft-com:vml" xmlns:wp14="http://schemas.microsoft.com/office/word/2010/wordprocessingDrawing" xmlns:wp="http://schemas.openxmlformats.org/drawingml/2006/wordprocessingDrawing" xmlns:w10="urn:schemas-microsoft-com:office:word" xmlns:w="http://schemas.openxmlformats.org/wordprocessingml/2006/main" xmlns:w14="http://schemas.microsoft.com/office/word/2010/wordml" xmlns:w15="http://schemas.microsoft.com/office/word/2012/wordml" xmlns:w16cex="http://schemas.microsoft.com/office/word/2018/wordml/cex" xmlns:w16cid="http://schemas.microsoft.com/office/word/2016/wordml/cid" xmlns:w16="http://schemas.microsoft.com/office/word/2018/wordml" xmlns:w16sdtdh="http://schemas.microsoft.com/office/word/2020/wordml/sdtdatahash" xmlns:w16se="http://schemas.microsoft.com/office/word/2015/wordml/symex" xmlns:wpg="http://schemas.microsoft.com/office/word/2010/wordprocessingGroup" xmlns:wpi="http://schemas.microsoft.com/office/word/2010/wordprocessingInk" xmlns:wne="http://schemas.microsoft.com/office/word/2006/wordml" xmlns:wps="http://schemas.microsoft.com/office/word/2010/wordprocessingShape" mc:Ignorable="w14 w15 w16se w16cid w16 w16cex w16sdtdh wp14">
   <w:abstractNum w:abstractNumId="0" w15:restartNumberingAfterBreak="0">
     <w:nsid w:val="07416C7F"/>
     <w:multiLevelType w:val="hybridMultilevel"/>
@@ -5521,7 +5754,7 @@
       </w:pPr>
     </w:lvl>
   </w:abstractNum>
-  <w:num w:numId="1" w16cid:durableId="1391268973">
+  <w:num w:numId="1">
     <w:abstractNumId w:val="0"/>
     <w:lvlOverride w:ilvl="0">
       <w:startOverride w:val="1"/>
@@ -5531,7 +5764,7 @@
 </file>
 
 <file path=word/styles.xml><?xml version="1.0" encoding="utf-8"?>
-<w:styles xmlns:mc="http://schemas.openxmlformats.org/markup-compatibility/2006" xmlns:r="http://schemas.openxmlformats.org/officeDocument/2006/relationships" xmlns:w="http://schemas.openxmlformats.org/wordprocessingml/2006/main" xmlns:w14="http://schemas.microsoft.com/office/word/2010/wordml" xmlns:w15="http://schemas.microsoft.com/office/word/2012/wordml" xmlns:w16cex="http://schemas.microsoft.com/office/word/2018/wordml/cex" xmlns:w16cid="http://schemas.microsoft.com/office/word/2016/wordml/cid" xmlns:w16="http://schemas.microsoft.com/office/word/2018/wordml" xmlns:w16du="http://schemas.microsoft.com/office/word/2023/wordml/word16du" xmlns:w16sdtdh="http://schemas.microsoft.com/office/word/2020/wordml/sdtdatahash" xmlns:w16sdtfl="http://schemas.microsoft.com/office/word/2024/wordml/sdtformatlock" xmlns:w16se="http://schemas.microsoft.com/office/word/2015/wordml/symex" mc:Ignorable="w14 w15 w16se w16cid w16 w16cex w16sdtdh w16sdtfl w16du">
+<w:styles xmlns:mc="http://schemas.openxmlformats.org/markup-compatibility/2006" xmlns:r="http://schemas.openxmlformats.org/officeDocument/2006/relationships" xmlns:w="http://schemas.openxmlformats.org/wordprocessingml/2006/main" xmlns:w14="http://schemas.microsoft.com/office/word/2010/wordml" xmlns:w15="http://schemas.microsoft.com/office/word/2012/wordml" xmlns:w16cex="http://schemas.microsoft.com/office/word/2018/wordml/cex" xmlns:w16cid="http://schemas.microsoft.com/office/word/2016/wordml/cid" xmlns:w16="http://schemas.microsoft.com/office/word/2018/wordml" xmlns:w16sdtdh="http://schemas.microsoft.com/office/word/2020/wordml/sdtdatahash" xmlns:w16se="http://schemas.microsoft.com/office/word/2015/wordml/symex" mc:Ignorable="w14 w15 w16se w16cid w16 w16cex w16sdtdh">
   <w:docDefaults>
     <w:rPrDefault>
       <w:rPr>

</xml_diff>